<commit_message>
Add "Bibliography" style as copy of "References" The style name for references is hard-coded in the pandoc writer
</commit_message>
<xml_diff>
--- a/_extensions/quarto-icots/quarto-icots.docx
+++ b/_extensions/quarto-icots/quarto-icots.docx
@@ -99,29 +99,51 @@
         <w:pStyle w:val="BodyText"/>
       </w:pPr>
       <w:r>
+        <w:rPr/>
         <w:t xml:space="preserve">Text of paper with first line </w:t>
       </w:r>
       <w:r>
+        <w:rPr/>
         <w:t>indented</w:t>
       </w:r>
       <w:r>
+        <w:rPr/>
         <w:t xml:space="preserve"> by 1.25 (0.5”) and then </w:t>
       </w:r>
-      <w:proofErr w:type="gramStart"/>
-      <w:r>
+      <w:r>
+        <w:rPr/>
         <w:t>continuing</w:t>
       </w:r>
       <w:r>
+        <w:rPr/>
         <w:t xml:space="preserve"> </w:t>
       </w:r>
       <w:r>
+        <w:rPr/>
         <w:t>on</w:t>
       </w:r>
-      <w:proofErr w:type="gramEnd"/>
-      <w:r>
-        <w:t xml:space="preserve"> to the next line like this.  The paragraph should be left and right justified.  You should use style=Body Text here</w:t>
-      </w:r>
-      <w:r>
+      <w:r>
+        <w:rPr/>
+        <w:t xml:space="preserve"> to the next line like this</w:t>
+      </w:r>
+      <w:r>
+        <w:rPr/>
+        <w:t xml:space="preserve">.  </w:t>
+      </w:r>
+      <w:r>
+        <w:rPr/>
+        <w:t>The paragraph should be left and right justified</w:t>
+      </w:r>
+      <w:r>
+        <w:rPr/>
+        <w:t xml:space="preserve">.  </w:t>
+      </w:r>
+      <w:r>
+        <w:rPr/>
+        <w:t>You should use style=Body Text here</w:t>
+      </w:r>
+      <w:r>
+        <w:rPr/>
         <w:t>.</w:t>
       </w:r>
     </w:p>
@@ -289,37 +311,51 @@
     </w:p>
     <w:p>
       <w:pPr>
-        <w:pStyle w:val="References"/>
-      </w:pPr>
-      <w:r>
-        <w:t xml:space="preserve">Author, A. (year). Title of my Article on Statistics Education. </w:t>
-      </w:r>
-      <w:r>
-        <w:rPr>
-          <w:i/>
-        </w:rPr>
-        <w:t>Title of the Journal where my article was published</w:t>
-      </w:r>
-      <w:r>
+        <w:pStyle w:val="Bibliography"/>
+      </w:pPr>
+      <w:r>
+        <w:rPr/>
+        <w:t>Author, A. (year). Title of my Article on Statistics Education.</w:t>
+      </w:r>
+      <w:r>
+        <w:rPr/>
+        <w:t xml:space="preserve"> </w:t>
+      </w:r>
+      <w:r>
+        <w:rPr/>
+        <w:t>Title of the</w:t>
+      </w:r>
+      <w:r>
+        <w:rPr/>
+        <w:t xml:space="preserve"> Journal where my article was published</w:t>
+      </w:r>
+      <w:r>
+        <w:rPr/>
         <w:t xml:space="preserve">, </w:t>
       </w:r>
       <w:r>
-        <w:rPr>
-          <w:i/>
-        </w:rPr>
+        <w:rPr/>
         <w:t>Volume number</w:t>
       </w:r>
       <w:r>
-        <w:rPr>
-          <w:i/>
-        </w:rPr>
+        <w:rPr/>
         <w:t xml:space="preserve"> </w:t>
       </w:r>
       <w:r>
+        <w:rPr/>
         <w:t>(issue number)</w:t>
       </w:r>
       <w:r>
-        <w:t>, Page-numbers.</w:t>
+        <w:rPr/>
+        <w:t xml:space="preserve">, </w:t>
+      </w:r>
+      <w:r>
+        <w:rPr/>
+        <w:t>Page-numbers</w:t>
+      </w:r>
+      <w:r>
+        <w:rPr/>
+        <w:t>.</w:t>
       </w:r>
     </w:p>
     <w:p>
@@ -371,7 +407,7 @@
       </w:pPr>
     </w:p>
     <w:sectPr>
-      <w:pgSz w:w="11901" w:h="16817" w:code="124"/>
+      <w:pgSz w:w="11901" w:h="16817" w:orient="portrait" w:code="124"/>
       <w:pgMar w:top="1418" w:right="1418" w:bottom="1418" w:left="1418" w:header="709" w:footer="709" w:gutter="0"/>
       <w:cols w:space="720"/>
     </w:sectPr>
@@ -419,6 +455,342 @@
 
 <file path=word/numbering.xml><?xml version="1.0" encoding="utf-8"?>
 <w:numbering xmlns:wpc="http://schemas.microsoft.com/office/word/2010/wordprocessingCanvas" xmlns:cx="http://schemas.microsoft.com/office/drawing/2014/chartex" xmlns:cx1="http://schemas.microsoft.com/office/drawing/2015/9/8/chartex" xmlns:cx2="http://schemas.microsoft.com/office/drawing/2015/10/21/chartex" xmlns:cx3="http://schemas.microsoft.com/office/drawing/2016/5/9/chartex" xmlns:cx4="http://schemas.microsoft.com/office/drawing/2016/5/10/chartex" xmlns:cx5="http://schemas.microsoft.com/office/drawing/2016/5/11/chartex" xmlns:cx6="http://schemas.microsoft.com/office/drawing/2016/5/12/chartex" xmlns:cx7="http://schemas.microsoft.com/office/drawing/2016/5/13/chartex" xmlns:cx8="http://schemas.microsoft.com/office/drawing/2016/5/14/chartex" xmlns:mc="http://schemas.openxmlformats.org/markup-compatibility/2006" xmlns:aink="http://schemas.microsoft.com/office/drawing/2016/ink" xmlns:am3d="http://schemas.microsoft.com/office/drawing/2017/model3d" xmlns:o="urn:schemas-microsoft-com:office:office" xmlns:oel="http://schemas.microsoft.com/office/2019/extlst" xmlns:r="http://schemas.openxmlformats.org/officeDocument/2006/relationships" xmlns:m="http://schemas.openxmlformats.org/officeDocument/2006/math" xmlns:v="urn:schemas-microsoft-com:vml" xmlns:wp14="http://schemas.microsoft.com/office/word/2010/wordprocessingDrawing" xmlns:wp="http://schemas.openxmlformats.org/drawingml/2006/wordprocessingDrawing" xmlns:w10="urn:schemas-microsoft-com:office:word" xmlns:w="http://schemas.openxmlformats.org/wordprocessingml/2006/main" xmlns:w14="http://schemas.microsoft.com/office/word/2010/wordml" xmlns:w15="http://schemas.microsoft.com/office/word/2012/wordml" xmlns:w16cex="http://schemas.microsoft.com/office/word/2018/wordml/cex" xmlns:w16cid="http://schemas.microsoft.com/office/word/2016/wordml/cid" xmlns:w16="http://schemas.microsoft.com/office/word/2018/wordml" xmlns:w16du="http://schemas.microsoft.com/office/word/2023/wordml/word16du" xmlns:w16sdtdh="http://schemas.microsoft.com/office/word/2020/wordml/sdtdatahash" xmlns:w16sdtfl="http://schemas.microsoft.com/office/word/2024/wordml/sdtformatlock" xmlns:w16se="http://schemas.microsoft.com/office/word/2015/wordml/symex" xmlns:wpg="http://schemas.microsoft.com/office/word/2010/wordprocessingGroup" xmlns:wpi="http://schemas.microsoft.com/office/word/2010/wordprocessingInk" xmlns:wne="http://schemas.microsoft.com/office/word/2006/wordml" xmlns:wps="http://schemas.microsoft.com/office/word/2010/wordprocessingShape" mc:Ignorable="w14 w15 w16se w16cid w16 w16cex w16sdtdh w16sdtfl w16du wp14">
+  <w:abstractNum xmlns:w="http://schemas.openxmlformats.org/wordprocessingml/2006/main" w:abstractNumId="12">
+    <w:nsid w:val="3f80ed71"/>
+    <w:multiLevelType xmlns:w="http://schemas.openxmlformats.org/wordprocessingml/2006/main" w:val="hybridMultilevel"/>
+    <w:lvl xmlns:w="http://schemas.openxmlformats.org/wordprocessingml/2006/main" w:ilvl="0">
+      <w:start w:val="1"/>
+      <w:numFmt w:val="bullet"/>
+      <w:lvlText w:val=""/>
+      <w:lvlJc w:val="left"/>
+      <w:pPr>
+        <w:ind w:left="1080" w:hanging="360"/>
+      </w:pPr>
+      <w:rPr>
+        <w:rFonts w:hint="default" w:ascii="Symbol" w:hAnsi="Symbol"/>
+      </w:rPr>
+    </w:lvl>
+    <w:lvl xmlns:w="http://schemas.openxmlformats.org/wordprocessingml/2006/main" w:ilvl="1">
+      <w:start w:val="1"/>
+      <w:numFmt w:val="bullet"/>
+      <w:lvlText w:val="o"/>
+      <w:lvlJc w:val="left"/>
+      <w:pPr>
+        <w:ind w:left="1800" w:hanging="360"/>
+      </w:pPr>
+      <w:rPr>
+        <w:rFonts w:hint="default" w:ascii="Courier New" w:hAnsi="Courier New"/>
+      </w:rPr>
+    </w:lvl>
+    <w:lvl xmlns:w="http://schemas.openxmlformats.org/wordprocessingml/2006/main" w:ilvl="2">
+      <w:start w:val="1"/>
+      <w:numFmt w:val="bullet"/>
+      <w:lvlText w:val=""/>
+      <w:lvlJc w:val="left"/>
+      <w:pPr>
+        <w:ind w:left="2520" w:hanging="360"/>
+      </w:pPr>
+      <w:rPr>
+        <w:rFonts w:hint="default" w:ascii="Wingdings" w:hAnsi="Wingdings"/>
+      </w:rPr>
+    </w:lvl>
+    <w:lvl xmlns:w="http://schemas.openxmlformats.org/wordprocessingml/2006/main" w:ilvl="3">
+      <w:start w:val="1"/>
+      <w:numFmt w:val="bullet"/>
+      <w:lvlText w:val=""/>
+      <w:lvlJc w:val="left"/>
+      <w:pPr>
+        <w:ind w:left="3240" w:hanging="360"/>
+      </w:pPr>
+      <w:rPr>
+        <w:rFonts w:hint="default" w:ascii="Symbol" w:hAnsi="Symbol"/>
+      </w:rPr>
+    </w:lvl>
+    <w:lvl xmlns:w="http://schemas.openxmlformats.org/wordprocessingml/2006/main" w:ilvl="4">
+      <w:start w:val="1"/>
+      <w:numFmt w:val="bullet"/>
+      <w:lvlText w:val="o"/>
+      <w:lvlJc w:val="left"/>
+      <w:pPr>
+        <w:ind w:left="3960" w:hanging="360"/>
+      </w:pPr>
+      <w:rPr>
+        <w:rFonts w:hint="default" w:ascii="Courier New" w:hAnsi="Courier New"/>
+      </w:rPr>
+    </w:lvl>
+    <w:lvl xmlns:w="http://schemas.openxmlformats.org/wordprocessingml/2006/main" w:ilvl="5">
+      <w:start w:val="1"/>
+      <w:numFmt w:val="bullet"/>
+      <w:lvlText w:val=""/>
+      <w:lvlJc w:val="left"/>
+      <w:pPr>
+        <w:ind w:left="4680" w:hanging="360"/>
+      </w:pPr>
+      <w:rPr>
+        <w:rFonts w:hint="default" w:ascii="Wingdings" w:hAnsi="Wingdings"/>
+      </w:rPr>
+    </w:lvl>
+    <w:lvl xmlns:w="http://schemas.openxmlformats.org/wordprocessingml/2006/main" w:ilvl="6">
+      <w:start w:val="1"/>
+      <w:numFmt w:val="bullet"/>
+      <w:lvlText w:val=""/>
+      <w:lvlJc w:val="left"/>
+      <w:pPr>
+        <w:ind w:left="5400" w:hanging="360"/>
+      </w:pPr>
+      <w:rPr>
+        <w:rFonts w:hint="default" w:ascii="Symbol" w:hAnsi="Symbol"/>
+      </w:rPr>
+    </w:lvl>
+    <w:lvl xmlns:w="http://schemas.openxmlformats.org/wordprocessingml/2006/main" w:ilvl="7">
+      <w:start w:val="1"/>
+      <w:numFmt w:val="bullet"/>
+      <w:lvlText w:val="o"/>
+      <w:lvlJc w:val="left"/>
+      <w:pPr>
+        <w:ind w:left="6120" w:hanging="360"/>
+      </w:pPr>
+      <w:rPr>
+        <w:rFonts w:hint="default" w:ascii="Courier New" w:hAnsi="Courier New"/>
+      </w:rPr>
+    </w:lvl>
+    <w:lvl xmlns:w="http://schemas.openxmlformats.org/wordprocessingml/2006/main" w:ilvl="8">
+      <w:start w:val="1"/>
+      <w:numFmt w:val="bullet"/>
+      <w:lvlText w:val=""/>
+      <w:lvlJc w:val="left"/>
+      <w:pPr>
+        <w:ind w:left="6840" w:hanging="360"/>
+      </w:pPr>
+      <w:rPr>
+        <w:rFonts w:hint="default" w:ascii="Wingdings" w:hAnsi="Wingdings"/>
+      </w:rPr>
+    </w:lvl>
+  </w:abstractNum>
+  <w:abstractNum xmlns:w="http://schemas.openxmlformats.org/wordprocessingml/2006/main" w:abstractNumId="11">
+    <w:nsid w:val="7c55f19"/>
+    <w:multiLevelType xmlns:w="http://schemas.openxmlformats.org/wordprocessingml/2006/main" w:val="hybridMultilevel"/>
+    <w:lvl xmlns:w="http://schemas.openxmlformats.org/wordprocessingml/2006/main" w:ilvl="0">
+      <w:start w:val="1"/>
+      <w:numFmt w:val="bullet"/>
+      <w:lvlText w:val=""/>
+      <w:lvlJc w:val="left"/>
+      <w:pPr>
+        <w:ind w:left="1800" w:hanging="360"/>
+      </w:pPr>
+      <w:rPr>
+        <w:rFonts w:hint="default" w:ascii="Symbol" w:hAnsi="Symbol"/>
+      </w:rPr>
+    </w:lvl>
+    <w:lvl xmlns:w="http://schemas.openxmlformats.org/wordprocessingml/2006/main" w:ilvl="1">
+      <w:start w:val="1"/>
+      <w:numFmt w:val="bullet"/>
+      <w:lvlText w:val="o"/>
+      <w:lvlJc w:val="left"/>
+      <w:pPr>
+        <w:ind w:left="2520" w:hanging="360"/>
+      </w:pPr>
+      <w:rPr>
+        <w:rFonts w:hint="default" w:ascii="Courier New" w:hAnsi="Courier New"/>
+      </w:rPr>
+    </w:lvl>
+    <w:lvl xmlns:w="http://schemas.openxmlformats.org/wordprocessingml/2006/main" w:ilvl="2">
+      <w:start w:val="1"/>
+      <w:numFmt w:val="bullet"/>
+      <w:lvlText w:val=""/>
+      <w:lvlJc w:val="left"/>
+      <w:pPr>
+        <w:ind w:left="3240" w:hanging="360"/>
+      </w:pPr>
+      <w:rPr>
+        <w:rFonts w:hint="default" w:ascii="Wingdings" w:hAnsi="Wingdings"/>
+      </w:rPr>
+    </w:lvl>
+    <w:lvl xmlns:w="http://schemas.openxmlformats.org/wordprocessingml/2006/main" w:ilvl="3">
+      <w:start w:val="1"/>
+      <w:numFmt w:val="bullet"/>
+      <w:lvlText w:val=""/>
+      <w:lvlJc w:val="left"/>
+      <w:pPr>
+        <w:ind w:left="3960" w:hanging="360"/>
+      </w:pPr>
+      <w:rPr>
+        <w:rFonts w:hint="default" w:ascii="Symbol" w:hAnsi="Symbol"/>
+      </w:rPr>
+    </w:lvl>
+    <w:lvl xmlns:w="http://schemas.openxmlformats.org/wordprocessingml/2006/main" w:ilvl="4">
+      <w:start w:val="1"/>
+      <w:numFmt w:val="bullet"/>
+      <w:lvlText w:val="o"/>
+      <w:lvlJc w:val="left"/>
+      <w:pPr>
+        <w:ind w:left="4680" w:hanging="360"/>
+      </w:pPr>
+      <w:rPr>
+        <w:rFonts w:hint="default" w:ascii="Courier New" w:hAnsi="Courier New"/>
+      </w:rPr>
+    </w:lvl>
+    <w:lvl xmlns:w="http://schemas.openxmlformats.org/wordprocessingml/2006/main" w:ilvl="5">
+      <w:start w:val="1"/>
+      <w:numFmt w:val="bullet"/>
+      <w:lvlText w:val=""/>
+      <w:lvlJc w:val="left"/>
+      <w:pPr>
+        <w:ind w:left="5400" w:hanging="360"/>
+      </w:pPr>
+      <w:rPr>
+        <w:rFonts w:hint="default" w:ascii="Wingdings" w:hAnsi="Wingdings"/>
+      </w:rPr>
+    </w:lvl>
+    <w:lvl xmlns:w="http://schemas.openxmlformats.org/wordprocessingml/2006/main" w:ilvl="6">
+      <w:start w:val="1"/>
+      <w:numFmt w:val="bullet"/>
+      <w:lvlText w:val=""/>
+      <w:lvlJc w:val="left"/>
+      <w:pPr>
+        <w:ind w:left="6120" w:hanging="360"/>
+      </w:pPr>
+      <w:rPr>
+        <w:rFonts w:hint="default" w:ascii="Symbol" w:hAnsi="Symbol"/>
+      </w:rPr>
+    </w:lvl>
+    <w:lvl xmlns:w="http://schemas.openxmlformats.org/wordprocessingml/2006/main" w:ilvl="7">
+      <w:start w:val="1"/>
+      <w:numFmt w:val="bullet"/>
+      <w:lvlText w:val="o"/>
+      <w:lvlJc w:val="left"/>
+      <w:pPr>
+        <w:ind w:left="6840" w:hanging="360"/>
+      </w:pPr>
+      <w:rPr>
+        <w:rFonts w:hint="default" w:ascii="Courier New" w:hAnsi="Courier New"/>
+      </w:rPr>
+    </w:lvl>
+    <w:lvl xmlns:w="http://schemas.openxmlformats.org/wordprocessingml/2006/main" w:ilvl="8">
+      <w:start w:val="1"/>
+      <w:numFmt w:val="bullet"/>
+      <w:lvlText w:val=""/>
+      <w:lvlJc w:val="left"/>
+      <w:pPr>
+        <w:ind w:left="7560" w:hanging="360"/>
+      </w:pPr>
+      <w:rPr>
+        <w:rFonts w:hint="default" w:ascii="Wingdings" w:hAnsi="Wingdings"/>
+      </w:rPr>
+    </w:lvl>
+  </w:abstractNum>
+  <w:abstractNum xmlns:w="http://schemas.openxmlformats.org/wordprocessingml/2006/main" w:abstractNumId="10">
+    <w:nsid w:val="66667aed"/>
+    <w:multiLevelType xmlns:w="http://schemas.openxmlformats.org/wordprocessingml/2006/main" w:val="hybridMultilevel"/>
+    <w:lvl xmlns:w="http://schemas.openxmlformats.org/wordprocessingml/2006/main" w:ilvl="0">
+      <w:start w:val="1"/>
+      <w:numFmt w:val="bullet"/>
+      <w:lvlText w:val=""/>
+      <w:lvlJc w:val="left"/>
+      <w:pPr>
+        <w:ind w:left="1800" w:hanging="360"/>
+      </w:pPr>
+      <w:rPr>
+        <w:rFonts w:hint="default" w:ascii="Symbol" w:hAnsi="Symbol"/>
+      </w:rPr>
+    </w:lvl>
+    <w:lvl xmlns:w="http://schemas.openxmlformats.org/wordprocessingml/2006/main" w:ilvl="1">
+      <w:start w:val="1"/>
+      <w:numFmt w:val="bullet"/>
+      <w:lvlText w:val="o"/>
+      <w:lvlJc w:val="left"/>
+      <w:pPr>
+        <w:ind w:left="2520" w:hanging="360"/>
+      </w:pPr>
+      <w:rPr>
+        <w:rFonts w:hint="default" w:ascii="Courier New" w:hAnsi="Courier New"/>
+      </w:rPr>
+    </w:lvl>
+    <w:lvl xmlns:w="http://schemas.openxmlformats.org/wordprocessingml/2006/main" w:ilvl="2">
+      <w:start w:val="1"/>
+      <w:numFmt w:val="bullet"/>
+      <w:lvlText w:val=""/>
+      <w:lvlJc w:val="left"/>
+      <w:pPr>
+        <w:ind w:left="3240" w:hanging="360"/>
+      </w:pPr>
+      <w:rPr>
+        <w:rFonts w:hint="default" w:ascii="Wingdings" w:hAnsi="Wingdings"/>
+      </w:rPr>
+    </w:lvl>
+    <w:lvl xmlns:w="http://schemas.openxmlformats.org/wordprocessingml/2006/main" w:ilvl="3">
+      <w:start w:val="1"/>
+      <w:numFmt w:val="bullet"/>
+      <w:lvlText w:val=""/>
+      <w:lvlJc w:val="left"/>
+      <w:pPr>
+        <w:ind w:left="3960" w:hanging="360"/>
+      </w:pPr>
+      <w:rPr>
+        <w:rFonts w:hint="default" w:ascii="Symbol" w:hAnsi="Symbol"/>
+      </w:rPr>
+    </w:lvl>
+    <w:lvl xmlns:w="http://schemas.openxmlformats.org/wordprocessingml/2006/main" w:ilvl="4">
+      <w:start w:val="1"/>
+      <w:numFmt w:val="bullet"/>
+      <w:lvlText w:val="o"/>
+      <w:lvlJc w:val="left"/>
+      <w:pPr>
+        <w:ind w:left="4680" w:hanging="360"/>
+      </w:pPr>
+      <w:rPr>
+        <w:rFonts w:hint="default" w:ascii="Courier New" w:hAnsi="Courier New"/>
+      </w:rPr>
+    </w:lvl>
+    <w:lvl xmlns:w="http://schemas.openxmlformats.org/wordprocessingml/2006/main" w:ilvl="5">
+      <w:start w:val="1"/>
+      <w:numFmt w:val="bullet"/>
+      <w:lvlText w:val=""/>
+      <w:lvlJc w:val="left"/>
+      <w:pPr>
+        <w:ind w:left="5400" w:hanging="360"/>
+      </w:pPr>
+      <w:rPr>
+        <w:rFonts w:hint="default" w:ascii="Wingdings" w:hAnsi="Wingdings"/>
+      </w:rPr>
+    </w:lvl>
+    <w:lvl xmlns:w="http://schemas.openxmlformats.org/wordprocessingml/2006/main" w:ilvl="6">
+      <w:start w:val="1"/>
+      <w:numFmt w:val="bullet"/>
+      <w:lvlText w:val=""/>
+      <w:lvlJc w:val="left"/>
+      <w:pPr>
+        <w:ind w:left="6120" w:hanging="360"/>
+      </w:pPr>
+      <w:rPr>
+        <w:rFonts w:hint="default" w:ascii="Symbol" w:hAnsi="Symbol"/>
+      </w:rPr>
+    </w:lvl>
+    <w:lvl xmlns:w="http://schemas.openxmlformats.org/wordprocessingml/2006/main" w:ilvl="7">
+      <w:start w:val="1"/>
+      <w:numFmt w:val="bullet"/>
+      <w:lvlText w:val="o"/>
+      <w:lvlJc w:val="left"/>
+      <w:pPr>
+        <w:ind w:left="6840" w:hanging="360"/>
+      </w:pPr>
+      <w:rPr>
+        <w:rFonts w:hint="default" w:ascii="Courier New" w:hAnsi="Courier New"/>
+      </w:rPr>
+    </w:lvl>
+    <w:lvl xmlns:w="http://schemas.openxmlformats.org/wordprocessingml/2006/main" w:ilvl="8">
+      <w:start w:val="1"/>
+      <w:numFmt w:val="bullet"/>
+      <w:lvlText w:val=""/>
+      <w:lvlJc w:val="left"/>
+      <w:pPr>
+        <w:ind w:left="7560" w:hanging="360"/>
+      </w:pPr>
+      <w:rPr>
+        <w:rFonts w:hint="default" w:ascii="Wingdings" w:hAnsi="Wingdings"/>
+      </w:rPr>
+    </w:lvl>
+  </w:abstractNum>
   <w:abstractNum w:abstractNumId="0" w15:restartNumberingAfterBreak="0">
     <w:nsid w:val="008D4186"/>
     <w:multiLevelType w:val="singleLevel"/>
@@ -435,7 +807,7 @@
         <w:ind w:left="360" w:hanging="360"/>
       </w:pPr>
       <w:rPr>
-        <w:rFonts w:ascii="Symbol" w:hAnsi="Symbol" w:hint="default"/>
+        <w:rFonts w:hint="default" w:ascii="Symbol" w:hAnsi="Symbol"/>
       </w:rPr>
     </w:lvl>
   </w:abstractNum>
@@ -455,7 +827,7 @@
         <w:ind w:left="360" w:hanging="360"/>
       </w:pPr>
       <w:rPr>
-        <w:rFonts w:ascii="Symbol" w:hAnsi="Symbol" w:hint="default"/>
+        <w:rFonts w:hint="default" w:ascii="Symbol" w:hAnsi="Symbol"/>
       </w:rPr>
     </w:lvl>
   </w:abstractNum>
@@ -475,7 +847,7 @@
         <w:ind w:left="360" w:hanging="360"/>
       </w:pPr>
       <w:rPr>
-        <w:rFonts w:ascii="Symbol" w:hAnsi="Symbol" w:hint="default"/>
+        <w:rFonts w:hint="default" w:ascii="Symbol" w:hAnsi="Symbol"/>
       </w:rPr>
     </w:lvl>
   </w:abstractNum>
@@ -495,7 +867,7 @@
         <w:ind w:left="360" w:hanging="360"/>
       </w:pPr>
       <w:rPr>
-        <w:rFonts w:ascii="Symbol" w:hAnsi="Symbol" w:hint="default"/>
+        <w:rFonts w:hint="default" w:ascii="Symbol" w:hAnsi="Symbol"/>
       </w:rPr>
     </w:lvl>
   </w:abstractNum>
@@ -515,7 +887,7 @@
         <w:ind w:left="360" w:hanging="360"/>
       </w:pPr>
       <w:rPr>
-        <w:rFonts w:ascii="Symbol" w:hAnsi="Symbol" w:hint="default"/>
+        <w:rFonts w:hint="default" w:ascii="Symbol" w:hAnsi="Symbol"/>
       </w:rPr>
     </w:lvl>
   </w:abstractNum>
@@ -535,7 +907,7 @@
         <w:ind w:left="360" w:hanging="360"/>
       </w:pPr>
       <w:rPr>
-        <w:rFonts w:ascii="Symbol" w:hAnsi="Symbol" w:hint="default"/>
+        <w:rFonts w:hint="default" w:ascii="Symbol" w:hAnsi="Symbol"/>
       </w:rPr>
     </w:lvl>
   </w:abstractNum>
@@ -555,7 +927,7 @@
         <w:ind w:left="360" w:hanging="360"/>
       </w:pPr>
       <w:rPr>
-        <w:rFonts w:ascii="Symbol" w:hAnsi="Symbol" w:hint="default"/>
+        <w:rFonts w:hint="default" w:ascii="Symbol" w:hAnsi="Symbol"/>
       </w:rPr>
     </w:lvl>
   </w:abstractNum>
@@ -575,7 +947,7 @@
         <w:ind w:left="360" w:hanging="360"/>
       </w:pPr>
       <w:rPr>
-        <w:rFonts w:ascii="Symbol" w:hAnsi="Symbol" w:hint="default"/>
+        <w:rFonts w:hint="default" w:ascii="Symbol" w:hAnsi="Symbol"/>
       </w:rPr>
     </w:lvl>
   </w:abstractNum>
@@ -595,7 +967,7 @@
         <w:ind w:left="360" w:hanging="360"/>
       </w:pPr>
       <w:rPr>
-        <w:rFonts w:ascii="Symbol" w:hAnsi="Symbol" w:hint="default"/>
+        <w:rFonts w:hint="default" w:ascii="Symbol" w:hAnsi="Symbol"/>
       </w:rPr>
     </w:lvl>
   </w:abstractNum>
@@ -615,10 +987,19 @@
         <w:ind w:left="360" w:hanging="360"/>
       </w:pPr>
       <w:rPr>
-        <w:rFonts w:ascii="Symbol" w:hAnsi="Symbol" w:hint="default"/>
+        <w:rFonts w:hint="default" w:ascii="Symbol" w:hAnsi="Symbol"/>
       </w:rPr>
     </w:lvl>
   </w:abstractNum>
+  <w:num w:numId="13">
+    <w:abstractNumId w:val="12"/>
+  </w:num>
+  <w:num w:numId="12">
+    <w:abstractNumId w:val="11"/>
+  </w:num>
+  <w:num w:numId="11">
+    <w:abstractNumId w:val="10"/>
+  </w:num>
   <w:num w:numId="1" w16cid:durableId="370107763">
     <w:abstractNumId w:val="1"/>
   </w:num>
@@ -657,7 +1038,7 @@
   <w:docDefaults>
     <w:rPrDefault>
       <w:rPr>
-        <w:rFonts w:ascii="Times New Roman" w:eastAsia="Times New Roman" w:hAnsi="Times New Roman" w:cs="Times New Roman"/>
+        <w:rFonts w:ascii="Times New Roman" w:hAnsi="Times New Roman" w:eastAsia="Times New Roman" w:cs="Times New Roman"/>
         <w:lang w:val="en-AU" w:eastAsia="ja-JP" w:bidi="hi-IN"/>
       </w:rPr>
     </w:rPrDefault>
@@ -668,12 +1049,12 @@
     <w:lsdException w:name="heading 1" w:uiPriority="9" w:qFormat="1"/>
     <w:lsdException w:name="heading 2" w:uiPriority="9" w:qFormat="1"/>
     <w:lsdException w:name="heading 3" w:uiPriority="9" w:qFormat="1"/>
-    <w:lsdException w:name="heading 4" w:semiHidden="1" w:uiPriority="9" w:unhideWhenUsed="1" w:qFormat="1"/>
-    <w:lsdException w:name="heading 5" w:semiHidden="1" w:uiPriority="9" w:unhideWhenUsed="1" w:qFormat="1"/>
-    <w:lsdException w:name="heading 6" w:semiHidden="1" w:uiPriority="9" w:unhideWhenUsed="1" w:qFormat="1"/>
-    <w:lsdException w:name="heading 7" w:semiHidden="1" w:uiPriority="9" w:unhideWhenUsed="1" w:qFormat="1"/>
-    <w:lsdException w:name="heading 8" w:semiHidden="1" w:uiPriority="9" w:unhideWhenUsed="1" w:qFormat="1"/>
-    <w:lsdException w:name="heading 9" w:semiHidden="1" w:uiPriority="9" w:unhideWhenUsed="1" w:qFormat="1"/>
+    <w:lsdException w:name="heading 4" w:uiPriority="9" w:semiHidden="1" w:unhideWhenUsed="1" w:qFormat="1"/>
+    <w:lsdException w:name="heading 5" w:uiPriority="9" w:semiHidden="1" w:unhideWhenUsed="1" w:qFormat="1"/>
+    <w:lsdException w:name="heading 6" w:uiPriority="9" w:semiHidden="1" w:unhideWhenUsed="1" w:qFormat="1"/>
+    <w:lsdException w:name="heading 7" w:uiPriority="9" w:semiHidden="1" w:unhideWhenUsed="1" w:qFormat="1"/>
+    <w:lsdException w:name="heading 8" w:uiPriority="9" w:semiHidden="1" w:unhideWhenUsed="1" w:qFormat="1"/>
+    <w:lsdException w:name="heading 9" w:uiPriority="9" w:semiHidden="1" w:unhideWhenUsed="1" w:qFormat="1"/>
     <w:lsdException w:name="index 1" w:semiHidden="1" w:unhideWhenUsed="1"/>
     <w:lsdException w:name="index 2" w:semiHidden="1" w:unhideWhenUsed="1"/>
     <w:lsdException w:name="index 3" w:semiHidden="1" w:unhideWhenUsed="1"/>
@@ -683,22 +1064,22 @@
     <w:lsdException w:name="index 7" w:semiHidden="1" w:unhideWhenUsed="1"/>
     <w:lsdException w:name="index 8" w:semiHidden="1" w:unhideWhenUsed="1"/>
     <w:lsdException w:name="index 9" w:semiHidden="1" w:unhideWhenUsed="1"/>
-    <w:lsdException w:name="toc 1" w:semiHidden="1" w:uiPriority="39" w:unhideWhenUsed="1"/>
-    <w:lsdException w:name="toc 2" w:semiHidden="1" w:uiPriority="39" w:unhideWhenUsed="1"/>
-    <w:lsdException w:name="toc 3" w:semiHidden="1" w:uiPriority="39" w:unhideWhenUsed="1"/>
-    <w:lsdException w:name="toc 4" w:semiHidden="1" w:uiPriority="39" w:unhideWhenUsed="1"/>
-    <w:lsdException w:name="toc 5" w:semiHidden="1" w:uiPriority="39" w:unhideWhenUsed="1"/>
-    <w:lsdException w:name="toc 6" w:semiHidden="1" w:uiPriority="39" w:unhideWhenUsed="1"/>
-    <w:lsdException w:name="toc 7" w:semiHidden="1" w:uiPriority="39" w:unhideWhenUsed="1"/>
-    <w:lsdException w:name="toc 8" w:semiHidden="1" w:uiPriority="39" w:unhideWhenUsed="1"/>
-    <w:lsdException w:name="toc 9" w:semiHidden="1" w:uiPriority="39" w:unhideWhenUsed="1"/>
+    <w:lsdException w:name="toc 1" w:uiPriority="39" w:semiHidden="1" w:unhideWhenUsed="1"/>
+    <w:lsdException w:name="toc 2" w:uiPriority="39" w:semiHidden="1" w:unhideWhenUsed="1"/>
+    <w:lsdException w:name="toc 3" w:uiPriority="39" w:semiHidden="1" w:unhideWhenUsed="1"/>
+    <w:lsdException w:name="toc 4" w:uiPriority="39" w:semiHidden="1" w:unhideWhenUsed="1"/>
+    <w:lsdException w:name="toc 5" w:uiPriority="39" w:semiHidden="1" w:unhideWhenUsed="1"/>
+    <w:lsdException w:name="toc 6" w:uiPriority="39" w:semiHidden="1" w:unhideWhenUsed="1"/>
+    <w:lsdException w:name="toc 7" w:uiPriority="39" w:semiHidden="1" w:unhideWhenUsed="1"/>
+    <w:lsdException w:name="toc 8" w:uiPriority="39" w:semiHidden="1" w:unhideWhenUsed="1"/>
+    <w:lsdException w:name="toc 9" w:uiPriority="39" w:semiHidden="1" w:unhideWhenUsed="1"/>
     <w:lsdException w:name="Normal Indent" w:semiHidden="1" w:unhideWhenUsed="1"/>
     <w:lsdException w:name="footnote text" w:semiHidden="1" w:unhideWhenUsed="1"/>
     <w:lsdException w:name="annotation text" w:semiHidden="1" w:unhideWhenUsed="1"/>
     <w:lsdException w:name="header" w:semiHidden="1" w:unhideWhenUsed="1"/>
     <w:lsdException w:name="footer" w:semiHidden="1" w:unhideWhenUsed="1"/>
     <w:lsdException w:name="index heading" w:semiHidden="1" w:unhideWhenUsed="1"/>
-    <w:lsdException w:name="caption" w:semiHidden="1" w:uiPriority="35" w:unhideWhenUsed="1" w:qFormat="1"/>
+    <w:lsdException w:name="caption" w:uiPriority="35" w:semiHidden="1" w:unhideWhenUsed="1" w:qFormat="1"/>
     <w:lsdException w:name="table of figures" w:semiHidden="1" w:unhideWhenUsed="1"/>
     <w:lsdException w:name="envelope address" w:semiHidden="1" w:unhideWhenUsed="1"/>
     <w:lsdException w:name="envelope return" w:semiHidden="1" w:unhideWhenUsed="1"/>
@@ -729,7 +1110,7 @@
     <w:lsdException w:name="Title" w:uiPriority="10" w:qFormat="1"/>
     <w:lsdException w:name="Closing" w:semiHidden="1" w:unhideWhenUsed="1"/>
     <w:lsdException w:name="Signature" w:semiHidden="1" w:unhideWhenUsed="1"/>
-    <w:lsdException w:name="Default Paragraph Font" w:semiHidden="1" w:uiPriority="1" w:unhideWhenUsed="1"/>
+    <w:lsdException w:name="Default Paragraph Font" w:uiPriority="1" w:semiHidden="1" w:unhideWhenUsed="1"/>
     <w:lsdException w:name="Body Text" w:semiHidden="1" w:unhideWhenUsed="1"/>
     <w:lsdException w:name="Body Text Indent" w:semiHidden="1" w:unhideWhenUsed="1"/>
     <w:lsdException w:name="List Continue" w:semiHidden="1" w:unhideWhenUsed="1"/>
@@ -930,7 +1311,7 @@
     <w:lsdException w:name="Intense Reference" w:uiPriority="68" w:qFormat="1"/>
     <w:lsdException w:name="Book Title" w:uiPriority="69" w:qFormat="1"/>
     <w:lsdException w:name="Bibliography" w:uiPriority="70"/>
-    <w:lsdException w:name="TOC Heading" w:semiHidden="1" w:uiPriority="71" w:unhideWhenUsed="1" w:qFormat="1"/>
+    <w:lsdException w:name="TOC Heading" w:uiPriority="71" w:semiHidden="1" w:unhideWhenUsed="1" w:qFormat="1"/>
     <w:lsdException w:name="Plain Table 1" w:uiPriority="72"/>
     <w:lsdException w:name="Plain Table 2" w:uiPriority="73"/>
     <w:lsdException w:name="Plain Table 3" w:uiPriority="19" w:qFormat="1"/>
@@ -1041,7 +1422,7 @@
     <w:lsdException w:name="Unresolved Mention" w:semiHidden="1" w:unhideWhenUsed="1"/>
     <w:lsdException w:name="Smart Link" w:semiHidden="1" w:unhideWhenUsed="1"/>
   </w:latentStyles>
-  <w:style w:type="paragraph" w:default="1" w:styleId="Normal">
+  <w:style w:type="paragraph" w:styleId="Normal" w:default="1">
     <w:name w:val="Normal"/>
     <w:qFormat/>
     <w:rsid w:val="00110D81"/>
@@ -1096,13 +1477,13 @@
       <w:szCs w:val="26"/>
     </w:rPr>
   </w:style>
-  <w:style w:type="character" w:default="1" w:styleId="DefaultParagraphFont">
+  <w:style w:type="character" w:styleId="DefaultParagraphFont" w:default="1">
     <w:name w:val="Default Paragraph Font"/>
     <w:uiPriority w:val="1"/>
     <w:semiHidden/>
     <w:unhideWhenUsed/>
   </w:style>
-  <w:style w:type="table" w:default="1" w:styleId="TableNormal">
+  <w:style w:type="table" w:styleId="TableNormal" w:default="1">
     <w:name w:val="Normal Table"/>
     <w:uiPriority w:val="99"/>
     <w:semiHidden/>
@@ -1117,7 +1498,7 @@
       </w:tblCellMar>
     </w:tblPr>
   </w:style>
-  <w:style w:type="numbering" w:default="1" w:styleId="NoList">
+  <w:style w:type="numbering" w:styleId="NoList" w:default="1">
     <w:name w:val="No List"/>
     <w:uiPriority w:val="99"/>
     <w:semiHidden/>
@@ -1132,7 +1513,7 @@
       <w:jc w:val="both"/>
     </w:pPr>
   </w:style>
-  <w:style w:type="paragraph" w:customStyle="1" w:styleId="Abstract">
+  <w:style w:type="paragraph" w:styleId="Abstract" w:customStyle="1">
     <w:name w:val="Abstract"/>
     <w:basedOn w:val="Normal"/>
     <w:rsid w:val="00783611"/>
@@ -1160,7 +1541,7 @@
       <w:lang w:val="en-US" w:eastAsia="en-US" w:bidi="ar-SA"/>
     </w:rPr>
   </w:style>
-  <w:style w:type="paragraph" w:customStyle="1" w:styleId="References">
+  <w:style w:type="paragraph" w:styleId="References" w:customStyle="1">
     <w:name w:val="References"/>
     <w:basedOn w:val="Normal"/>
     <w:rsid w:val="00110D81"/>
@@ -1169,11 +1550,38 @@
       <w:jc w:val="both"/>
     </w:pPr>
   </w:style>
+  <w:style w:type="paragraph" w:styleId="Bibliography" w:customStyle="true">
+    <w:uiPriority w:val="1"/>
+    <w:name w:val="Bibliography"/>
+    <w:basedOn w:val="Normal"/>
+    <w:link w:val="BibliographyChar"/>
+    <w:qFormat/>
+    <w:rsid w:val="54D90918"/>
+    <w:rPr>
+      <w:rFonts w:ascii="Times New Roman" w:hAnsi="Times New Roman" w:eastAsia="Times New Roman" w:cs="Times New Roman"/>
+    </w:rPr>
+    <w:pPr>
+      <w:ind w:left="360" w:hanging="360"/>
+      <w:jc w:val="both"/>
+    </w:pPr>
+  </w:style>
+  <w:style w:type="character" w:styleId="BibliographyChar" w:customStyle="true">
+    <w:name w:val="Bibliography Char"/>
+    <w:basedOn w:val="DefaultParagraphFont"/>
+    <w:link w:val="Bibliography"/>
+    <w:rsid w:val="54D90918"/>
+    <w:rPr>
+      <w:rFonts w:ascii="Times New Roman" w:hAnsi="Times New Roman" w:eastAsia="Times New Roman" w:cs="Times New Roman"/>
+      <w:sz w:val="22"/>
+      <w:szCs w:val="22"/>
+      <w:lang w:val="en-US" w:eastAsia="en-US" w:bidi="ar-SA"/>
+    </w:rPr>
+  </w:style>
 </w:styles>
 </file>
 
 <file path=word/theme/theme1.xml><?xml version="1.0" encoding="utf-8"?>
-<a:theme xmlns:a="http://schemas.openxmlformats.org/drawingml/2006/main" name="Office Theme">
+<a:theme xmlns:a="http://schemas.openxmlformats.org/drawingml/2006/main" xmlns:thm15="http://schemas.microsoft.com/office/thememl/2012/main" name="Office Theme">
   <a:themeElements>
     <a:clrScheme name="Office">
       <a:dk1>

</xml_diff>

<commit_message>
Update reference doc to include BulletList style
</commit_message>
<xml_diff>
--- a/_extensions/quarto-icots/quarto-icots.docx
+++ b/_extensions/quarto-icots/quarto-icots.docx
@@ -58,30 +58,46 @@
         <w:pStyle w:val="Abstract"/>
       </w:pPr>
       <w:r>
+        <w:rPr/>
         <w:t>Put your ab</w:t>
       </w:r>
       <w:r>
+        <w:rPr/>
         <w:t xml:space="preserve">stract here: this text is not to exceed </w:t>
       </w:r>
       <w:r>
+        <w:rPr/>
         <w:t>125</w:t>
       </w:r>
       <w:r>
+        <w:rPr/>
         <w:t xml:space="preserve"> words. </w:t>
       </w:r>
       <w:r>
+        <w:rPr/>
         <w:t xml:space="preserve">Do </w:t>
       </w:r>
       <w:r>
         <w:rPr>
-          <w:b/>
+          <w:b w:val="1"/>
+          <w:bCs w:val="1"/>
         </w:rPr>
         <w:t>not</w:t>
       </w:r>
       <w:r>
-        <w:t xml:space="preserve"> start the abstract with the word “Abstract”.  </w:t>
-      </w:r>
-      <w:r>
+        <w:rPr/>
+        <w:t xml:space="preserve"> start the abstract with the word “Abstract</w:t>
+      </w:r>
+      <w:r>
+        <w:rPr/>
+        <w:t>”.</w:t>
+      </w:r>
+      <w:r>
+        <w:rPr/>
+        <w:t xml:space="preserve">  </w:t>
+      </w:r>
+      <w:r>
+        <w:rPr/>
         <w:t>Use style=Abstract.</w:t>
       </w:r>
     </w:p>
@@ -132,7 +148,11 @@
       </w:r>
       <w:r>
         <w:rPr/>
-        <w:t>The paragraph should be left and right justified</w:t>
+        <w:t>The paragraph should be left and right ju</w:t>
+      </w:r>
+      <w:r>
+        <w:rPr/>
+        <w:t>stified</w:t>
       </w:r>
       <w:r>
         <w:rPr/>
@@ -140,7 +160,11 @@
       </w:r>
       <w:r>
         <w:rPr/>
-        <w:t>You should use style=Body Text here</w:t>
+        <w:t>Yo</w:t>
+      </w:r>
+      <w:r>
+        <w:rPr/>
+        <w:t>u should use style=Body Text here</w:t>
       </w:r>
       <w:r>
         <w:rPr/>
@@ -184,61 +208,37 @@
     </w:p>
     <w:p>
       <w:pPr>
-        <w:numPr>
-          <w:ilvl w:val="0"/>
-          <w:numId w:val="3"/>
-        </w:numPr>
-        <w:jc w:val="both"/>
+        <w:pStyle w:val="BulletList"/>
         <w:rPr>
-          <w:snapToGrid w:val="0"/>
-          <w:color w:val="000000"/>
+          <w:color w:val="000000" w:themeColor="text1" w:themeTint="FF" w:themeShade="FF"/>
         </w:rPr>
       </w:pPr>
       <w:r>
+        <w:rPr/>
+        <w:t>Bulleted list</w:t>
+      </w:r>
+    </w:p>
+    <w:p>
+      <w:pPr>
+        <w:pStyle w:val="BulletList"/>
         <w:rPr>
-          <w:snapToGrid w:val="0"/>
-          <w:color w:val="000000"/>
+          <w:color w:val="000000" w:themeColor="text1" w:themeTint="FF" w:themeShade="FF"/>
         </w:rPr>
+      </w:pPr>
+      <w:r>
+        <w:rPr/>
         <w:t>Bulleted list</w:t>
       </w:r>
     </w:p>
     <w:p>
       <w:pPr>
-        <w:numPr>
-          <w:ilvl w:val="0"/>
-          <w:numId w:val="3"/>
-        </w:numPr>
-        <w:jc w:val="both"/>
+        <w:pStyle w:val="BulletList"/>
         <w:rPr>
-          <w:snapToGrid w:val="0"/>
-          <w:color w:val="000000"/>
+          <w:color w:val="000000" w:themeColor="text1" w:themeTint="FF" w:themeShade="FF"/>
         </w:rPr>
       </w:pPr>
       <w:r>
-        <w:rPr>
-          <w:snapToGrid w:val="0"/>
-          <w:color w:val="000000"/>
-        </w:rPr>
-        <w:t>Bulleted list</w:t>
-      </w:r>
-    </w:p>
-    <w:p>
-      <w:pPr>
-        <w:numPr>
-          <w:ilvl w:val="0"/>
-          <w:numId w:val="3"/>
-        </w:numPr>
-        <w:jc w:val="both"/>
-        <w:rPr>
-          <w:snapToGrid w:val="0"/>
-          <w:color w:val="000000"/>
-        </w:rPr>
-      </w:pPr>
-      <w:r>
-        <w:rPr>
-          <w:snapToGrid w:val="0"/>
-          <w:color w:val="000000"/>
-        </w:rPr>
+        <w:rPr/>
         <w:t>Bulleted list</w:t>
       </w:r>
     </w:p>
@@ -1556,7 +1556,7 @@
     <w:basedOn w:val="Normal"/>
     <w:link w:val="BibliographyChar"/>
     <w:qFormat/>
-    <w:rsid w:val="54D90918"/>
+    <w:rsid w:val="755330E5"/>
     <w:rPr>
       <w:rFonts w:ascii="Times New Roman" w:hAnsi="Times New Roman" w:eastAsia="Times New Roman" w:cs="Times New Roman"/>
     </w:rPr>
@@ -1569,9 +1569,79 @@
     <w:name w:val="Bibliography Char"/>
     <w:basedOn w:val="DefaultParagraphFont"/>
     <w:link w:val="Bibliography"/>
-    <w:rsid w:val="54D90918"/>
+    <w:rsid w:val="755330E5"/>
     <w:rPr>
       <w:rFonts w:ascii="Times New Roman" w:hAnsi="Times New Roman" w:eastAsia="Times New Roman" w:cs="Times New Roman"/>
+      <w:sz w:val="22"/>
+      <w:szCs w:val="22"/>
+      <w:lang w:val="en-US" w:eastAsia="en-US" w:bidi="ar-SA"/>
+    </w:rPr>
+  </w:style>
+  <w:style w:type="paragraph" w:styleId="ImageCaption" w:customStyle="true">
+    <w:uiPriority w:val="1"/>
+    <w:name w:val="ImageCaption"/>
+    <w:basedOn w:val="Normal"/>
+    <w:link w:val="ImageCaptionChar"/>
+    <w:qFormat/>
+    <w:rsid w:val="755330E5"/>
+    <w:rPr>
+      <w:rFonts w:ascii="Times New Roman" w:hAnsi="Times New Roman" w:eastAsia="Times New Roman" w:cs="Times New Roman"/>
+    </w:rPr>
+    <w:pPr>
+      <w:jc w:val="center"/>
+    </w:pPr>
+  </w:style>
+  <w:style w:type="character" w:styleId="ImageCaptionChar" w:customStyle="true">
+    <w:name w:val="ImageCaption Char"/>
+    <w:basedOn w:val="DefaultParagraphFont"/>
+    <w:link w:val="ImageCaption"/>
+    <w:rsid w:val="755330E5"/>
+    <w:rPr>
+      <w:rFonts w:ascii="Times New Roman" w:hAnsi="Times New Roman" w:eastAsia="Times New Roman" w:cs="Times New Roman"/>
+      <w:sz w:val="22"/>
+      <w:szCs w:val="22"/>
+      <w:lang w:val="en-US" w:eastAsia="en-US" w:bidi="ar-SA"/>
+    </w:rPr>
+  </w:style>
+  <w:style w:type="paragraph" w:styleId="ListParagraph">
+    <w:uiPriority w:val="34"/>
+    <w:name w:val="List Paragraph"/>
+    <w:basedOn w:val="Normal"/>
+    <w:qFormat/>
+    <w:rsid w:val="755330E5"/>
+    <w:pPr>
+      <w:spacing/>
+      <w:ind w:left="720"/>
+      <w:contextualSpacing/>
+    </w:pPr>
+  </w:style>
+  <w:style w:type="paragraph" w:styleId="BulletList" w:customStyle="true">
+    <w:uiPriority w:val="1"/>
+    <w:name w:val="BulletList"/>
+    <w:basedOn w:val="Normal"/>
+    <w:link w:val="BulletListChar"/>
+    <w:qFormat/>
+    <w:rsid w:val="755330E5"/>
+    <w:rPr>
+      <w:rFonts w:ascii="Times New Roman" w:hAnsi="Times New Roman" w:eastAsia="Times New Roman" w:cs="Times New Roman"/>
+      <w:color w:val="000000" w:themeColor="text1" w:themeTint="FF" w:themeShade="FF"/>
+    </w:rPr>
+    <w:pPr>
+      <w:numPr>
+        <w:ilvl w:val="0"/>
+        <w:numId w:val="3"/>
+      </w:numPr>
+      <w:jc w:val="both"/>
+    </w:pPr>
+  </w:style>
+  <w:style w:type="character" w:styleId="BulletListChar" w:customStyle="true">
+    <w:name w:val="BulletList Char"/>
+    <w:basedOn w:val="DefaultParagraphFont"/>
+    <w:link w:val="BulletList"/>
+    <w:rsid w:val="755330E5"/>
+    <w:rPr>
+      <w:rFonts w:ascii="Times New Roman" w:hAnsi="Times New Roman" w:eastAsia="Times New Roman" w:cs="Times New Roman"/>
+      <w:color w:val="000000" w:themeColor="text1" w:themeTint="FF" w:themeShade="FF"/>
       <w:sz w:val="22"/>
       <w:szCs w:val="22"/>
       <w:lang w:val="en-US" w:eastAsia="en-US" w:bidi="ar-SA"/>

</xml_diff>

<commit_message>
change style for code/markdown block
</commit_message>
<xml_diff>
--- a/_extensions/quarto-icots/quarto-icots.docx
+++ b/_extensions/quarto-icots/quarto-icots.docx
@@ -58,46 +58,31 @@
         <w:pStyle w:val="Abstract"/>
       </w:pPr>
       <w:r>
-        <w:rPr/>
         <w:t>Put your ab</w:t>
       </w:r>
       <w:r>
-        <w:rPr/>
         <w:t xml:space="preserve">stract here: this text is not to exceed </w:t>
       </w:r>
       <w:r>
-        <w:rPr/>
         <w:t>125</w:t>
       </w:r>
       <w:r>
-        <w:rPr/>
         <w:t xml:space="preserve"> words. </w:t>
       </w:r>
       <w:r>
-        <w:rPr/>
         <w:t xml:space="preserve">Do </w:t>
       </w:r>
       <w:r>
         <w:rPr>
-          <w:b w:val="1"/>
-          <w:bCs w:val="1"/>
+          <w:b/>
+          <w:bCs/>
         </w:rPr>
         <w:t>not</w:t>
       </w:r>
       <w:r>
-        <w:rPr/>
-        <w:t xml:space="preserve"> start the abstract with the word “Abstract</w:t>
-      </w:r>
-      <w:r>
-        <w:rPr/>
-        <w:t>”.</w:t>
-      </w:r>
-      <w:r>
-        <w:rPr/>
-        <w:t xml:space="preserve">  </w:t>
-      </w:r>
-      <w:r>
-        <w:rPr/>
+        <w:t xml:space="preserve"> start the abstract with the word “Abstract”.  </w:t>
+      </w:r>
+      <w:r>
         <w:t>Use style=Abstract.</w:t>
       </w:r>
     </w:p>
@@ -115,59 +100,23 @@
         <w:pStyle w:val="BodyText"/>
       </w:pPr>
       <w:r>
-        <w:rPr/>
-        <w:t xml:space="preserve">Text of paper with first line </w:t>
-      </w:r>
-      <w:r>
-        <w:rPr/>
-        <w:t>indented</w:t>
-      </w:r>
-      <w:r>
-        <w:rPr/>
-        <w:t xml:space="preserve"> by 1.25 (0.5”) and then </w:t>
-      </w:r>
-      <w:r>
-        <w:rPr/>
+        <w:t xml:space="preserve">Text of paper with first line indented by 1.25 (0.5”) and then </w:t>
+      </w:r>
+      <w:proofErr w:type="gramStart"/>
+      <w:r>
         <w:t>continuing</w:t>
       </w:r>
       <w:r>
-        <w:rPr/>
         <w:t xml:space="preserve"> </w:t>
       </w:r>
       <w:r>
-        <w:rPr/>
         <w:t>on</w:t>
       </w:r>
-      <w:r>
-        <w:rPr/>
-        <w:t xml:space="preserve"> to the next line like this</w:t>
-      </w:r>
-      <w:r>
-        <w:rPr/>
-        <w:t xml:space="preserve">.  </w:t>
-      </w:r>
-      <w:r>
-        <w:rPr/>
-        <w:t>The paragraph should be left and right ju</w:t>
-      </w:r>
-      <w:r>
-        <w:rPr/>
-        <w:t>stified</w:t>
-      </w:r>
-      <w:r>
-        <w:rPr/>
-        <w:t xml:space="preserve">.  </w:t>
-      </w:r>
-      <w:r>
-        <w:rPr/>
-        <w:t>Yo</w:t>
-      </w:r>
-      <w:r>
-        <w:rPr/>
-        <w:t>u should use style=Body Text here</w:t>
-      </w:r>
-      <w:r>
-        <w:rPr/>
+      <w:proofErr w:type="gramEnd"/>
+      <w:r>
+        <w:t xml:space="preserve"> to the next line like this.  The paragraph should be left and right justified.  You should use style=Body Text here</w:t>
+      </w:r>
+      <w:r>
         <w:t>.</w:t>
       </w:r>
     </w:p>
@@ -209,36 +158,24 @@
     <w:p>
       <w:pPr>
         <w:pStyle w:val="BulletList"/>
-        <w:rPr>
-          <w:color w:val="000000" w:themeColor="text1" w:themeTint="FF" w:themeShade="FF"/>
-        </w:rPr>
-      </w:pPr>
-      <w:r>
-        <w:rPr/>
+      </w:pPr>
+      <w:r>
         <w:t>Bulleted list</w:t>
       </w:r>
     </w:p>
     <w:p>
       <w:pPr>
         <w:pStyle w:val="BulletList"/>
-        <w:rPr>
-          <w:color w:val="000000" w:themeColor="text1" w:themeTint="FF" w:themeShade="FF"/>
-        </w:rPr>
-      </w:pPr>
-      <w:r>
-        <w:rPr/>
+      </w:pPr>
+      <w:r>
         <w:t>Bulleted list</w:t>
       </w:r>
     </w:p>
     <w:p>
       <w:pPr>
         <w:pStyle w:val="BulletList"/>
-        <w:rPr>
-          <w:color w:val="000000" w:themeColor="text1" w:themeTint="FF" w:themeShade="FF"/>
-        </w:rPr>
-      </w:pPr>
-      <w:r>
-        <w:rPr/>
+      </w:pPr>
+      <w:r>
         <w:t>Bulleted list</w:t>
       </w:r>
     </w:p>
@@ -311,51 +248,16 @@
     </w:p>
     <w:p>
       <w:pPr>
-        <w:pStyle w:val="Bibliography"/>
-      </w:pPr>
-      <w:r>
-        <w:rPr/>
-        <w:t>Author, A. (year). Title of my Article on Statistics Education.</w:t>
-      </w:r>
-      <w:r>
-        <w:rPr/>
+        <w:pStyle w:val="Bibliography1"/>
+      </w:pPr>
+      <w:r>
+        <w:t>Author, A. (year). Title of my Article on Statistics Education. Title of the Journal where my article was published, Volume number</w:t>
+      </w:r>
+      <w:r>
         <w:t xml:space="preserve"> </w:t>
       </w:r>
       <w:r>
-        <w:rPr/>
-        <w:t>Title of the</w:t>
-      </w:r>
-      <w:r>
-        <w:rPr/>
-        <w:t xml:space="preserve"> Journal where my article was published</w:t>
-      </w:r>
-      <w:r>
-        <w:rPr/>
-        <w:t xml:space="preserve">, </w:t>
-      </w:r>
-      <w:r>
-        <w:rPr/>
-        <w:t>Volume number</w:t>
-      </w:r>
-      <w:r>
-        <w:rPr/>
-        <w:t xml:space="preserve"> </w:t>
-      </w:r>
-      <w:r>
-        <w:rPr/>
-        <w:t>(issue number)</w:t>
-      </w:r>
-      <w:r>
-        <w:rPr/>
-        <w:t xml:space="preserve">, </w:t>
-      </w:r>
-      <w:r>
-        <w:rPr/>
-        <w:t>Page-numbers</w:t>
-      </w:r>
-      <w:r>
-        <w:rPr/>
-        <w:t>.</w:t>
+        <w:t>(issue number), Page-numbers.</w:t>
       </w:r>
     </w:p>
     <w:p>
@@ -407,7 +309,7 @@
       </w:pPr>
     </w:p>
     <w:sectPr>
-      <w:pgSz w:w="11901" w:h="16817" w:orient="portrait" w:code="124"/>
+      <w:pgSz w:w="11901" w:h="16817" w:code="124"/>
       <w:pgMar w:top="1418" w:right="1418" w:bottom="1418" w:left="1418" w:header="709" w:footer="709" w:gutter="0"/>
       <w:cols w:space="720"/>
     </w:sectPr>
@@ -455,342 +357,6 @@
 
 <file path=word/numbering.xml><?xml version="1.0" encoding="utf-8"?>
 <w:numbering xmlns:wpc="http://schemas.microsoft.com/office/word/2010/wordprocessingCanvas" xmlns:cx="http://schemas.microsoft.com/office/drawing/2014/chartex" xmlns:cx1="http://schemas.microsoft.com/office/drawing/2015/9/8/chartex" xmlns:cx2="http://schemas.microsoft.com/office/drawing/2015/10/21/chartex" xmlns:cx3="http://schemas.microsoft.com/office/drawing/2016/5/9/chartex" xmlns:cx4="http://schemas.microsoft.com/office/drawing/2016/5/10/chartex" xmlns:cx5="http://schemas.microsoft.com/office/drawing/2016/5/11/chartex" xmlns:cx6="http://schemas.microsoft.com/office/drawing/2016/5/12/chartex" xmlns:cx7="http://schemas.microsoft.com/office/drawing/2016/5/13/chartex" xmlns:cx8="http://schemas.microsoft.com/office/drawing/2016/5/14/chartex" xmlns:mc="http://schemas.openxmlformats.org/markup-compatibility/2006" xmlns:aink="http://schemas.microsoft.com/office/drawing/2016/ink" xmlns:am3d="http://schemas.microsoft.com/office/drawing/2017/model3d" xmlns:o="urn:schemas-microsoft-com:office:office" xmlns:oel="http://schemas.microsoft.com/office/2019/extlst" xmlns:r="http://schemas.openxmlformats.org/officeDocument/2006/relationships" xmlns:m="http://schemas.openxmlformats.org/officeDocument/2006/math" xmlns:v="urn:schemas-microsoft-com:vml" xmlns:wp14="http://schemas.microsoft.com/office/word/2010/wordprocessingDrawing" xmlns:wp="http://schemas.openxmlformats.org/drawingml/2006/wordprocessingDrawing" xmlns:w10="urn:schemas-microsoft-com:office:word" xmlns:w="http://schemas.openxmlformats.org/wordprocessingml/2006/main" xmlns:w14="http://schemas.microsoft.com/office/word/2010/wordml" xmlns:w15="http://schemas.microsoft.com/office/word/2012/wordml" xmlns:w16cex="http://schemas.microsoft.com/office/word/2018/wordml/cex" xmlns:w16cid="http://schemas.microsoft.com/office/word/2016/wordml/cid" xmlns:w16="http://schemas.microsoft.com/office/word/2018/wordml" xmlns:w16du="http://schemas.microsoft.com/office/word/2023/wordml/word16du" xmlns:w16sdtdh="http://schemas.microsoft.com/office/word/2020/wordml/sdtdatahash" xmlns:w16sdtfl="http://schemas.microsoft.com/office/word/2024/wordml/sdtformatlock" xmlns:w16se="http://schemas.microsoft.com/office/word/2015/wordml/symex" xmlns:wpg="http://schemas.microsoft.com/office/word/2010/wordprocessingGroup" xmlns:wpi="http://schemas.microsoft.com/office/word/2010/wordprocessingInk" xmlns:wne="http://schemas.microsoft.com/office/word/2006/wordml" xmlns:wps="http://schemas.microsoft.com/office/word/2010/wordprocessingShape" mc:Ignorable="w14 w15 w16se w16cid w16 w16cex w16sdtdh w16sdtfl w16du wp14">
-  <w:abstractNum xmlns:w="http://schemas.openxmlformats.org/wordprocessingml/2006/main" w:abstractNumId="12">
-    <w:nsid w:val="3f80ed71"/>
-    <w:multiLevelType xmlns:w="http://schemas.openxmlformats.org/wordprocessingml/2006/main" w:val="hybridMultilevel"/>
-    <w:lvl xmlns:w="http://schemas.openxmlformats.org/wordprocessingml/2006/main" w:ilvl="0">
-      <w:start w:val="1"/>
-      <w:numFmt w:val="bullet"/>
-      <w:lvlText w:val=""/>
-      <w:lvlJc w:val="left"/>
-      <w:pPr>
-        <w:ind w:left="1080" w:hanging="360"/>
-      </w:pPr>
-      <w:rPr>
-        <w:rFonts w:hint="default" w:ascii="Symbol" w:hAnsi="Symbol"/>
-      </w:rPr>
-    </w:lvl>
-    <w:lvl xmlns:w="http://schemas.openxmlformats.org/wordprocessingml/2006/main" w:ilvl="1">
-      <w:start w:val="1"/>
-      <w:numFmt w:val="bullet"/>
-      <w:lvlText w:val="o"/>
-      <w:lvlJc w:val="left"/>
-      <w:pPr>
-        <w:ind w:left="1800" w:hanging="360"/>
-      </w:pPr>
-      <w:rPr>
-        <w:rFonts w:hint="default" w:ascii="Courier New" w:hAnsi="Courier New"/>
-      </w:rPr>
-    </w:lvl>
-    <w:lvl xmlns:w="http://schemas.openxmlformats.org/wordprocessingml/2006/main" w:ilvl="2">
-      <w:start w:val="1"/>
-      <w:numFmt w:val="bullet"/>
-      <w:lvlText w:val=""/>
-      <w:lvlJc w:val="left"/>
-      <w:pPr>
-        <w:ind w:left="2520" w:hanging="360"/>
-      </w:pPr>
-      <w:rPr>
-        <w:rFonts w:hint="default" w:ascii="Wingdings" w:hAnsi="Wingdings"/>
-      </w:rPr>
-    </w:lvl>
-    <w:lvl xmlns:w="http://schemas.openxmlformats.org/wordprocessingml/2006/main" w:ilvl="3">
-      <w:start w:val="1"/>
-      <w:numFmt w:val="bullet"/>
-      <w:lvlText w:val=""/>
-      <w:lvlJc w:val="left"/>
-      <w:pPr>
-        <w:ind w:left="3240" w:hanging="360"/>
-      </w:pPr>
-      <w:rPr>
-        <w:rFonts w:hint="default" w:ascii="Symbol" w:hAnsi="Symbol"/>
-      </w:rPr>
-    </w:lvl>
-    <w:lvl xmlns:w="http://schemas.openxmlformats.org/wordprocessingml/2006/main" w:ilvl="4">
-      <w:start w:val="1"/>
-      <w:numFmt w:val="bullet"/>
-      <w:lvlText w:val="o"/>
-      <w:lvlJc w:val="left"/>
-      <w:pPr>
-        <w:ind w:left="3960" w:hanging="360"/>
-      </w:pPr>
-      <w:rPr>
-        <w:rFonts w:hint="default" w:ascii="Courier New" w:hAnsi="Courier New"/>
-      </w:rPr>
-    </w:lvl>
-    <w:lvl xmlns:w="http://schemas.openxmlformats.org/wordprocessingml/2006/main" w:ilvl="5">
-      <w:start w:val="1"/>
-      <w:numFmt w:val="bullet"/>
-      <w:lvlText w:val=""/>
-      <w:lvlJc w:val="left"/>
-      <w:pPr>
-        <w:ind w:left="4680" w:hanging="360"/>
-      </w:pPr>
-      <w:rPr>
-        <w:rFonts w:hint="default" w:ascii="Wingdings" w:hAnsi="Wingdings"/>
-      </w:rPr>
-    </w:lvl>
-    <w:lvl xmlns:w="http://schemas.openxmlformats.org/wordprocessingml/2006/main" w:ilvl="6">
-      <w:start w:val="1"/>
-      <w:numFmt w:val="bullet"/>
-      <w:lvlText w:val=""/>
-      <w:lvlJc w:val="left"/>
-      <w:pPr>
-        <w:ind w:left="5400" w:hanging="360"/>
-      </w:pPr>
-      <w:rPr>
-        <w:rFonts w:hint="default" w:ascii="Symbol" w:hAnsi="Symbol"/>
-      </w:rPr>
-    </w:lvl>
-    <w:lvl xmlns:w="http://schemas.openxmlformats.org/wordprocessingml/2006/main" w:ilvl="7">
-      <w:start w:val="1"/>
-      <w:numFmt w:val="bullet"/>
-      <w:lvlText w:val="o"/>
-      <w:lvlJc w:val="left"/>
-      <w:pPr>
-        <w:ind w:left="6120" w:hanging="360"/>
-      </w:pPr>
-      <w:rPr>
-        <w:rFonts w:hint="default" w:ascii="Courier New" w:hAnsi="Courier New"/>
-      </w:rPr>
-    </w:lvl>
-    <w:lvl xmlns:w="http://schemas.openxmlformats.org/wordprocessingml/2006/main" w:ilvl="8">
-      <w:start w:val="1"/>
-      <w:numFmt w:val="bullet"/>
-      <w:lvlText w:val=""/>
-      <w:lvlJc w:val="left"/>
-      <w:pPr>
-        <w:ind w:left="6840" w:hanging="360"/>
-      </w:pPr>
-      <w:rPr>
-        <w:rFonts w:hint="default" w:ascii="Wingdings" w:hAnsi="Wingdings"/>
-      </w:rPr>
-    </w:lvl>
-  </w:abstractNum>
-  <w:abstractNum xmlns:w="http://schemas.openxmlformats.org/wordprocessingml/2006/main" w:abstractNumId="11">
-    <w:nsid w:val="7c55f19"/>
-    <w:multiLevelType xmlns:w="http://schemas.openxmlformats.org/wordprocessingml/2006/main" w:val="hybridMultilevel"/>
-    <w:lvl xmlns:w="http://schemas.openxmlformats.org/wordprocessingml/2006/main" w:ilvl="0">
-      <w:start w:val="1"/>
-      <w:numFmt w:val="bullet"/>
-      <w:lvlText w:val=""/>
-      <w:lvlJc w:val="left"/>
-      <w:pPr>
-        <w:ind w:left="1800" w:hanging="360"/>
-      </w:pPr>
-      <w:rPr>
-        <w:rFonts w:hint="default" w:ascii="Symbol" w:hAnsi="Symbol"/>
-      </w:rPr>
-    </w:lvl>
-    <w:lvl xmlns:w="http://schemas.openxmlformats.org/wordprocessingml/2006/main" w:ilvl="1">
-      <w:start w:val="1"/>
-      <w:numFmt w:val="bullet"/>
-      <w:lvlText w:val="o"/>
-      <w:lvlJc w:val="left"/>
-      <w:pPr>
-        <w:ind w:left="2520" w:hanging="360"/>
-      </w:pPr>
-      <w:rPr>
-        <w:rFonts w:hint="default" w:ascii="Courier New" w:hAnsi="Courier New"/>
-      </w:rPr>
-    </w:lvl>
-    <w:lvl xmlns:w="http://schemas.openxmlformats.org/wordprocessingml/2006/main" w:ilvl="2">
-      <w:start w:val="1"/>
-      <w:numFmt w:val="bullet"/>
-      <w:lvlText w:val=""/>
-      <w:lvlJc w:val="left"/>
-      <w:pPr>
-        <w:ind w:left="3240" w:hanging="360"/>
-      </w:pPr>
-      <w:rPr>
-        <w:rFonts w:hint="default" w:ascii="Wingdings" w:hAnsi="Wingdings"/>
-      </w:rPr>
-    </w:lvl>
-    <w:lvl xmlns:w="http://schemas.openxmlformats.org/wordprocessingml/2006/main" w:ilvl="3">
-      <w:start w:val="1"/>
-      <w:numFmt w:val="bullet"/>
-      <w:lvlText w:val=""/>
-      <w:lvlJc w:val="left"/>
-      <w:pPr>
-        <w:ind w:left="3960" w:hanging="360"/>
-      </w:pPr>
-      <w:rPr>
-        <w:rFonts w:hint="default" w:ascii="Symbol" w:hAnsi="Symbol"/>
-      </w:rPr>
-    </w:lvl>
-    <w:lvl xmlns:w="http://schemas.openxmlformats.org/wordprocessingml/2006/main" w:ilvl="4">
-      <w:start w:val="1"/>
-      <w:numFmt w:val="bullet"/>
-      <w:lvlText w:val="o"/>
-      <w:lvlJc w:val="left"/>
-      <w:pPr>
-        <w:ind w:left="4680" w:hanging="360"/>
-      </w:pPr>
-      <w:rPr>
-        <w:rFonts w:hint="default" w:ascii="Courier New" w:hAnsi="Courier New"/>
-      </w:rPr>
-    </w:lvl>
-    <w:lvl xmlns:w="http://schemas.openxmlformats.org/wordprocessingml/2006/main" w:ilvl="5">
-      <w:start w:val="1"/>
-      <w:numFmt w:val="bullet"/>
-      <w:lvlText w:val=""/>
-      <w:lvlJc w:val="left"/>
-      <w:pPr>
-        <w:ind w:left="5400" w:hanging="360"/>
-      </w:pPr>
-      <w:rPr>
-        <w:rFonts w:hint="default" w:ascii="Wingdings" w:hAnsi="Wingdings"/>
-      </w:rPr>
-    </w:lvl>
-    <w:lvl xmlns:w="http://schemas.openxmlformats.org/wordprocessingml/2006/main" w:ilvl="6">
-      <w:start w:val="1"/>
-      <w:numFmt w:val="bullet"/>
-      <w:lvlText w:val=""/>
-      <w:lvlJc w:val="left"/>
-      <w:pPr>
-        <w:ind w:left="6120" w:hanging="360"/>
-      </w:pPr>
-      <w:rPr>
-        <w:rFonts w:hint="default" w:ascii="Symbol" w:hAnsi="Symbol"/>
-      </w:rPr>
-    </w:lvl>
-    <w:lvl xmlns:w="http://schemas.openxmlformats.org/wordprocessingml/2006/main" w:ilvl="7">
-      <w:start w:val="1"/>
-      <w:numFmt w:val="bullet"/>
-      <w:lvlText w:val="o"/>
-      <w:lvlJc w:val="left"/>
-      <w:pPr>
-        <w:ind w:left="6840" w:hanging="360"/>
-      </w:pPr>
-      <w:rPr>
-        <w:rFonts w:hint="default" w:ascii="Courier New" w:hAnsi="Courier New"/>
-      </w:rPr>
-    </w:lvl>
-    <w:lvl xmlns:w="http://schemas.openxmlformats.org/wordprocessingml/2006/main" w:ilvl="8">
-      <w:start w:val="1"/>
-      <w:numFmt w:val="bullet"/>
-      <w:lvlText w:val=""/>
-      <w:lvlJc w:val="left"/>
-      <w:pPr>
-        <w:ind w:left="7560" w:hanging="360"/>
-      </w:pPr>
-      <w:rPr>
-        <w:rFonts w:hint="default" w:ascii="Wingdings" w:hAnsi="Wingdings"/>
-      </w:rPr>
-    </w:lvl>
-  </w:abstractNum>
-  <w:abstractNum xmlns:w="http://schemas.openxmlformats.org/wordprocessingml/2006/main" w:abstractNumId="10">
-    <w:nsid w:val="66667aed"/>
-    <w:multiLevelType xmlns:w="http://schemas.openxmlformats.org/wordprocessingml/2006/main" w:val="hybridMultilevel"/>
-    <w:lvl xmlns:w="http://schemas.openxmlformats.org/wordprocessingml/2006/main" w:ilvl="0">
-      <w:start w:val="1"/>
-      <w:numFmt w:val="bullet"/>
-      <w:lvlText w:val=""/>
-      <w:lvlJc w:val="left"/>
-      <w:pPr>
-        <w:ind w:left="1800" w:hanging="360"/>
-      </w:pPr>
-      <w:rPr>
-        <w:rFonts w:hint="default" w:ascii="Symbol" w:hAnsi="Symbol"/>
-      </w:rPr>
-    </w:lvl>
-    <w:lvl xmlns:w="http://schemas.openxmlformats.org/wordprocessingml/2006/main" w:ilvl="1">
-      <w:start w:val="1"/>
-      <w:numFmt w:val="bullet"/>
-      <w:lvlText w:val="o"/>
-      <w:lvlJc w:val="left"/>
-      <w:pPr>
-        <w:ind w:left="2520" w:hanging="360"/>
-      </w:pPr>
-      <w:rPr>
-        <w:rFonts w:hint="default" w:ascii="Courier New" w:hAnsi="Courier New"/>
-      </w:rPr>
-    </w:lvl>
-    <w:lvl xmlns:w="http://schemas.openxmlformats.org/wordprocessingml/2006/main" w:ilvl="2">
-      <w:start w:val="1"/>
-      <w:numFmt w:val="bullet"/>
-      <w:lvlText w:val=""/>
-      <w:lvlJc w:val="left"/>
-      <w:pPr>
-        <w:ind w:left="3240" w:hanging="360"/>
-      </w:pPr>
-      <w:rPr>
-        <w:rFonts w:hint="default" w:ascii="Wingdings" w:hAnsi="Wingdings"/>
-      </w:rPr>
-    </w:lvl>
-    <w:lvl xmlns:w="http://schemas.openxmlformats.org/wordprocessingml/2006/main" w:ilvl="3">
-      <w:start w:val="1"/>
-      <w:numFmt w:val="bullet"/>
-      <w:lvlText w:val=""/>
-      <w:lvlJc w:val="left"/>
-      <w:pPr>
-        <w:ind w:left="3960" w:hanging="360"/>
-      </w:pPr>
-      <w:rPr>
-        <w:rFonts w:hint="default" w:ascii="Symbol" w:hAnsi="Symbol"/>
-      </w:rPr>
-    </w:lvl>
-    <w:lvl xmlns:w="http://schemas.openxmlformats.org/wordprocessingml/2006/main" w:ilvl="4">
-      <w:start w:val="1"/>
-      <w:numFmt w:val="bullet"/>
-      <w:lvlText w:val="o"/>
-      <w:lvlJc w:val="left"/>
-      <w:pPr>
-        <w:ind w:left="4680" w:hanging="360"/>
-      </w:pPr>
-      <w:rPr>
-        <w:rFonts w:hint="default" w:ascii="Courier New" w:hAnsi="Courier New"/>
-      </w:rPr>
-    </w:lvl>
-    <w:lvl xmlns:w="http://schemas.openxmlformats.org/wordprocessingml/2006/main" w:ilvl="5">
-      <w:start w:val="1"/>
-      <w:numFmt w:val="bullet"/>
-      <w:lvlText w:val=""/>
-      <w:lvlJc w:val="left"/>
-      <w:pPr>
-        <w:ind w:left="5400" w:hanging="360"/>
-      </w:pPr>
-      <w:rPr>
-        <w:rFonts w:hint="default" w:ascii="Wingdings" w:hAnsi="Wingdings"/>
-      </w:rPr>
-    </w:lvl>
-    <w:lvl xmlns:w="http://schemas.openxmlformats.org/wordprocessingml/2006/main" w:ilvl="6">
-      <w:start w:val="1"/>
-      <w:numFmt w:val="bullet"/>
-      <w:lvlText w:val=""/>
-      <w:lvlJc w:val="left"/>
-      <w:pPr>
-        <w:ind w:left="6120" w:hanging="360"/>
-      </w:pPr>
-      <w:rPr>
-        <w:rFonts w:hint="default" w:ascii="Symbol" w:hAnsi="Symbol"/>
-      </w:rPr>
-    </w:lvl>
-    <w:lvl xmlns:w="http://schemas.openxmlformats.org/wordprocessingml/2006/main" w:ilvl="7">
-      <w:start w:val="1"/>
-      <w:numFmt w:val="bullet"/>
-      <w:lvlText w:val="o"/>
-      <w:lvlJc w:val="left"/>
-      <w:pPr>
-        <w:ind w:left="6840" w:hanging="360"/>
-      </w:pPr>
-      <w:rPr>
-        <w:rFonts w:hint="default" w:ascii="Courier New" w:hAnsi="Courier New"/>
-      </w:rPr>
-    </w:lvl>
-    <w:lvl xmlns:w="http://schemas.openxmlformats.org/wordprocessingml/2006/main" w:ilvl="8">
-      <w:start w:val="1"/>
-      <w:numFmt w:val="bullet"/>
-      <w:lvlText w:val=""/>
-      <w:lvlJc w:val="left"/>
-      <w:pPr>
-        <w:ind w:left="7560" w:hanging="360"/>
-      </w:pPr>
-      <w:rPr>
-        <w:rFonts w:hint="default" w:ascii="Wingdings" w:hAnsi="Wingdings"/>
-      </w:rPr>
-    </w:lvl>
-  </w:abstractNum>
   <w:abstractNum w:abstractNumId="0" w15:restartNumberingAfterBreak="0">
     <w:nsid w:val="008D4186"/>
     <w:multiLevelType w:val="singleLevel"/>
@@ -807,7 +373,7 @@
         <w:ind w:left="360" w:hanging="360"/>
       </w:pPr>
       <w:rPr>
-        <w:rFonts w:hint="default" w:ascii="Symbol" w:hAnsi="Symbol"/>
+        <w:rFonts w:ascii="Symbol" w:hAnsi="Symbol" w:hint="default"/>
       </w:rPr>
     </w:lvl>
   </w:abstractNum>
@@ -827,11 +393,124 @@
         <w:ind w:left="360" w:hanging="360"/>
       </w:pPr>
       <w:rPr>
-        <w:rFonts w:hint="default" w:ascii="Symbol" w:hAnsi="Symbol"/>
+        <w:rFonts w:ascii="Symbol" w:hAnsi="Symbol" w:hint="default"/>
       </w:rPr>
     </w:lvl>
   </w:abstractNum>
   <w:abstractNum w:abstractNumId="2" w15:restartNumberingAfterBreak="0">
+    <w:nsid w:val="07C55F19"/>
+    <w:multiLevelType w:val="hybridMultilevel"/>
+    <w:tmpl w:val="917CB056"/>
+    <w:lvl w:ilvl="0" w:tplc="45460A10">
+      <w:start w:val="1"/>
+      <w:numFmt w:val="bullet"/>
+      <w:lvlText w:val=""/>
+      <w:lvlJc w:val="left"/>
+      <w:pPr>
+        <w:ind w:left="1800" w:hanging="360"/>
+      </w:pPr>
+      <w:rPr>
+        <w:rFonts w:ascii="Symbol" w:hAnsi="Symbol" w:hint="default"/>
+      </w:rPr>
+    </w:lvl>
+    <w:lvl w:ilvl="1" w:tplc="69265C12">
+      <w:start w:val="1"/>
+      <w:numFmt w:val="bullet"/>
+      <w:lvlText w:val="o"/>
+      <w:lvlJc w:val="left"/>
+      <w:pPr>
+        <w:ind w:left="2520" w:hanging="360"/>
+      </w:pPr>
+      <w:rPr>
+        <w:rFonts w:ascii="Courier New" w:hAnsi="Courier New" w:hint="default"/>
+      </w:rPr>
+    </w:lvl>
+    <w:lvl w:ilvl="2" w:tplc="7EC0F418">
+      <w:start w:val="1"/>
+      <w:numFmt w:val="bullet"/>
+      <w:lvlText w:val=""/>
+      <w:lvlJc w:val="left"/>
+      <w:pPr>
+        <w:ind w:left="3240" w:hanging="360"/>
+      </w:pPr>
+      <w:rPr>
+        <w:rFonts w:ascii="Wingdings" w:hAnsi="Wingdings" w:hint="default"/>
+      </w:rPr>
+    </w:lvl>
+    <w:lvl w:ilvl="3" w:tplc="E556B692">
+      <w:start w:val="1"/>
+      <w:numFmt w:val="bullet"/>
+      <w:lvlText w:val=""/>
+      <w:lvlJc w:val="left"/>
+      <w:pPr>
+        <w:ind w:left="3960" w:hanging="360"/>
+      </w:pPr>
+      <w:rPr>
+        <w:rFonts w:ascii="Symbol" w:hAnsi="Symbol" w:hint="default"/>
+      </w:rPr>
+    </w:lvl>
+    <w:lvl w:ilvl="4" w:tplc="A19A10B4">
+      <w:start w:val="1"/>
+      <w:numFmt w:val="bullet"/>
+      <w:lvlText w:val="o"/>
+      <w:lvlJc w:val="left"/>
+      <w:pPr>
+        <w:ind w:left="4680" w:hanging="360"/>
+      </w:pPr>
+      <w:rPr>
+        <w:rFonts w:ascii="Courier New" w:hAnsi="Courier New" w:hint="default"/>
+      </w:rPr>
+    </w:lvl>
+    <w:lvl w:ilvl="5" w:tplc="23024D64">
+      <w:start w:val="1"/>
+      <w:numFmt w:val="bullet"/>
+      <w:lvlText w:val=""/>
+      <w:lvlJc w:val="left"/>
+      <w:pPr>
+        <w:ind w:left="5400" w:hanging="360"/>
+      </w:pPr>
+      <w:rPr>
+        <w:rFonts w:ascii="Wingdings" w:hAnsi="Wingdings" w:hint="default"/>
+      </w:rPr>
+    </w:lvl>
+    <w:lvl w:ilvl="6" w:tplc="7BD4E67C">
+      <w:start w:val="1"/>
+      <w:numFmt w:val="bullet"/>
+      <w:lvlText w:val=""/>
+      <w:lvlJc w:val="left"/>
+      <w:pPr>
+        <w:ind w:left="6120" w:hanging="360"/>
+      </w:pPr>
+      <w:rPr>
+        <w:rFonts w:ascii="Symbol" w:hAnsi="Symbol" w:hint="default"/>
+      </w:rPr>
+    </w:lvl>
+    <w:lvl w:ilvl="7" w:tplc="A8B46BD6">
+      <w:start w:val="1"/>
+      <w:numFmt w:val="bullet"/>
+      <w:lvlText w:val="o"/>
+      <w:lvlJc w:val="left"/>
+      <w:pPr>
+        <w:ind w:left="6840" w:hanging="360"/>
+      </w:pPr>
+      <w:rPr>
+        <w:rFonts w:ascii="Courier New" w:hAnsi="Courier New" w:hint="default"/>
+      </w:rPr>
+    </w:lvl>
+    <w:lvl w:ilvl="8" w:tplc="90581B68">
+      <w:start w:val="1"/>
+      <w:numFmt w:val="bullet"/>
+      <w:lvlText w:val=""/>
+      <w:lvlJc w:val="left"/>
+      <w:pPr>
+        <w:ind w:left="7560" w:hanging="360"/>
+      </w:pPr>
+      <w:rPr>
+        <w:rFonts w:ascii="Wingdings" w:hAnsi="Wingdings" w:hint="default"/>
+      </w:rPr>
+    </w:lvl>
+  </w:abstractNum>
+  <w:abstractNum w:abstractNumId="3" w15:restartNumberingAfterBreak="0">
     <w:nsid w:val="17B11AE5"/>
     <w:multiLevelType w:val="singleLevel"/>
     <w:tmpl w:val="04090001"/>
@@ -847,17 +526,18 @@
         <w:ind w:left="360" w:hanging="360"/>
       </w:pPr>
       <w:rPr>
-        <w:rFonts w:hint="default" w:ascii="Symbol" w:hAnsi="Symbol"/>
+        <w:rFonts w:ascii="Symbol" w:hAnsi="Symbol" w:hint="default"/>
       </w:rPr>
     </w:lvl>
   </w:abstractNum>
-  <w:abstractNum w:abstractNumId="3" w15:restartNumberingAfterBreak="0">
+  <w:abstractNum w:abstractNumId="4" w15:restartNumberingAfterBreak="0">
     <w:nsid w:val="198F38D1"/>
     <w:multiLevelType w:val="singleLevel"/>
     <w:tmpl w:val="04090001"/>
     <w:lvl w:ilvl="0">
       <w:start w:val="1"/>
       <w:numFmt w:val="bullet"/>
+      <w:pStyle w:val="BulletList"/>
       <w:lvlText w:val=""/>
       <w:lvlJc w:val="left"/>
       <w:pPr>
@@ -867,11 +547,11 @@
         <w:ind w:left="360" w:hanging="360"/>
       </w:pPr>
       <w:rPr>
-        <w:rFonts w:hint="default" w:ascii="Symbol" w:hAnsi="Symbol"/>
+        <w:rFonts w:ascii="Symbol" w:hAnsi="Symbol" w:hint="default"/>
       </w:rPr>
     </w:lvl>
   </w:abstractNum>
-  <w:abstractNum w:abstractNumId="4" w15:restartNumberingAfterBreak="0">
+  <w:abstractNum w:abstractNumId="5" w15:restartNumberingAfterBreak="0">
     <w:nsid w:val="31CF065F"/>
     <w:multiLevelType w:val="singleLevel"/>
     <w:tmpl w:val="04090001"/>
@@ -887,11 +567,124 @@
         <w:ind w:left="360" w:hanging="360"/>
       </w:pPr>
       <w:rPr>
-        <w:rFonts w:hint="default" w:ascii="Symbol" w:hAnsi="Symbol"/>
+        <w:rFonts w:ascii="Symbol" w:hAnsi="Symbol" w:hint="default"/>
       </w:rPr>
     </w:lvl>
   </w:abstractNum>
-  <w:abstractNum w:abstractNumId="5" w15:restartNumberingAfterBreak="0">
+  <w:abstractNum w:abstractNumId="6" w15:restartNumberingAfterBreak="0">
+    <w:nsid w:val="3F80ED71"/>
+    <w:multiLevelType w:val="hybridMultilevel"/>
+    <w:tmpl w:val="F866F840"/>
+    <w:lvl w:ilvl="0" w:tplc="770EED2C">
+      <w:start w:val="1"/>
+      <w:numFmt w:val="bullet"/>
+      <w:lvlText w:val=""/>
+      <w:lvlJc w:val="left"/>
+      <w:pPr>
+        <w:ind w:left="1080" w:hanging="360"/>
+      </w:pPr>
+      <w:rPr>
+        <w:rFonts w:ascii="Symbol" w:hAnsi="Symbol" w:hint="default"/>
+      </w:rPr>
+    </w:lvl>
+    <w:lvl w:ilvl="1" w:tplc="4CA27660">
+      <w:start w:val="1"/>
+      <w:numFmt w:val="bullet"/>
+      <w:lvlText w:val="o"/>
+      <w:lvlJc w:val="left"/>
+      <w:pPr>
+        <w:ind w:left="1800" w:hanging="360"/>
+      </w:pPr>
+      <w:rPr>
+        <w:rFonts w:ascii="Courier New" w:hAnsi="Courier New" w:hint="default"/>
+      </w:rPr>
+    </w:lvl>
+    <w:lvl w:ilvl="2" w:tplc="BBF2E478">
+      <w:start w:val="1"/>
+      <w:numFmt w:val="bullet"/>
+      <w:lvlText w:val=""/>
+      <w:lvlJc w:val="left"/>
+      <w:pPr>
+        <w:ind w:left="2520" w:hanging="360"/>
+      </w:pPr>
+      <w:rPr>
+        <w:rFonts w:ascii="Wingdings" w:hAnsi="Wingdings" w:hint="default"/>
+      </w:rPr>
+    </w:lvl>
+    <w:lvl w:ilvl="3" w:tplc="6F1AACF6">
+      <w:start w:val="1"/>
+      <w:numFmt w:val="bullet"/>
+      <w:lvlText w:val=""/>
+      <w:lvlJc w:val="left"/>
+      <w:pPr>
+        <w:ind w:left="3240" w:hanging="360"/>
+      </w:pPr>
+      <w:rPr>
+        <w:rFonts w:ascii="Symbol" w:hAnsi="Symbol" w:hint="default"/>
+      </w:rPr>
+    </w:lvl>
+    <w:lvl w:ilvl="4" w:tplc="FF145512">
+      <w:start w:val="1"/>
+      <w:numFmt w:val="bullet"/>
+      <w:lvlText w:val="o"/>
+      <w:lvlJc w:val="left"/>
+      <w:pPr>
+        <w:ind w:left="3960" w:hanging="360"/>
+      </w:pPr>
+      <w:rPr>
+        <w:rFonts w:ascii="Courier New" w:hAnsi="Courier New" w:hint="default"/>
+      </w:rPr>
+    </w:lvl>
+    <w:lvl w:ilvl="5" w:tplc="E586C0B6">
+      <w:start w:val="1"/>
+      <w:numFmt w:val="bullet"/>
+      <w:lvlText w:val=""/>
+      <w:lvlJc w:val="left"/>
+      <w:pPr>
+        <w:ind w:left="4680" w:hanging="360"/>
+      </w:pPr>
+      <w:rPr>
+        <w:rFonts w:ascii="Wingdings" w:hAnsi="Wingdings" w:hint="default"/>
+      </w:rPr>
+    </w:lvl>
+    <w:lvl w:ilvl="6" w:tplc="C14E795E">
+      <w:start w:val="1"/>
+      <w:numFmt w:val="bullet"/>
+      <w:lvlText w:val=""/>
+      <w:lvlJc w:val="left"/>
+      <w:pPr>
+        <w:ind w:left="5400" w:hanging="360"/>
+      </w:pPr>
+      <w:rPr>
+        <w:rFonts w:ascii="Symbol" w:hAnsi="Symbol" w:hint="default"/>
+      </w:rPr>
+    </w:lvl>
+    <w:lvl w:ilvl="7" w:tplc="97EA664E">
+      <w:start w:val="1"/>
+      <w:numFmt w:val="bullet"/>
+      <w:lvlText w:val="o"/>
+      <w:lvlJc w:val="left"/>
+      <w:pPr>
+        <w:ind w:left="6120" w:hanging="360"/>
+      </w:pPr>
+      <w:rPr>
+        <w:rFonts w:ascii="Courier New" w:hAnsi="Courier New" w:hint="default"/>
+      </w:rPr>
+    </w:lvl>
+    <w:lvl w:ilvl="8" w:tplc="369EBDCA">
+      <w:start w:val="1"/>
+      <w:numFmt w:val="bullet"/>
+      <w:lvlText w:val=""/>
+      <w:lvlJc w:val="left"/>
+      <w:pPr>
+        <w:ind w:left="6840" w:hanging="360"/>
+      </w:pPr>
+      <w:rPr>
+        <w:rFonts w:ascii="Wingdings" w:hAnsi="Wingdings" w:hint="default"/>
+      </w:rPr>
+    </w:lvl>
+  </w:abstractNum>
+  <w:abstractNum w:abstractNumId="7" w15:restartNumberingAfterBreak="0">
     <w:nsid w:val="43C76907"/>
     <w:multiLevelType w:val="singleLevel"/>
     <w:tmpl w:val="04090001"/>
@@ -907,11 +700,11 @@
         <w:ind w:left="360" w:hanging="360"/>
       </w:pPr>
       <w:rPr>
-        <w:rFonts w:hint="default" w:ascii="Symbol" w:hAnsi="Symbol"/>
+        <w:rFonts w:ascii="Symbol" w:hAnsi="Symbol" w:hint="default"/>
       </w:rPr>
     </w:lvl>
   </w:abstractNum>
-  <w:abstractNum w:abstractNumId="6" w15:restartNumberingAfterBreak="0">
+  <w:abstractNum w:abstractNumId="8" w15:restartNumberingAfterBreak="0">
     <w:nsid w:val="505109B2"/>
     <w:multiLevelType w:val="singleLevel"/>
     <w:tmpl w:val="04090001"/>
@@ -927,11 +720,11 @@
         <w:ind w:left="360" w:hanging="360"/>
       </w:pPr>
       <w:rPr>
-        <w:rFonts w:hint="default" w:ascii="Symbol" w:hAnsi="Symbol"/>
+        <w:rFonts w:ascii="Symbol" w:hAnsi="Symbol" w:hint="default"/>
       </w:rPr>
     </w:lvl>
   </w:abstractNum>
-  <w:abstractNum w:abstractNumId="7" w15:restartNumberingAfterBreak="0">
+  <w:abstractNum w:abstractNumId="9" w15:restartNumberingAfterBreak="0">
     <w:nsid w:val="60E44576"/>
     <w:multiLevelType w:val="singleLevel"/>
     <w:tmpl w:val="04090001"/>
@@ -947,11 +740,124 @@
         <w:ind w:left="360" w:hanging="360"/>
       </w:pPr>
       <w:rPr>
-        <w:rFonts w:hint="default" w:ascii="Symbol" w:hAnsi="Symbol"/>
+        <w:rFonts w:ascii="Symbol" w:hAnsi="Symbol" w:hint="default"/>
       </w:rPr>
     </w:lvl>
   </w:abstractNum>
-  <w:abstractNum w:abstractNumId="8" w15:restartNumberingAfterBreak="0">
+  <w:abstractNum w:abstractNumId="10" w15:restartNumberingAfterBreak="0">
+    <w:nsid w:val="66667AED"/>
+    <w:multiLevelType w:val="hybridMultilevel"/>
+    <w:tmpl w:val="0F687430"/>
+    <w:lvl w:ilvl="0" w:tplc="D8EE9E0C">
+      <w:start w:val="1"/>
+      <w:numFmt w:val="bullet"/>
+      <w:lvlText w:val=""/>
+      <w:lvlJc w:val="left"/>
+      <w:pPr>
+        <w:ind w:left="1800" w:hanging="360"/>
+      </w:pPr>
+      <w:rPr>
+        <w:rFonts w:ascii="Symbol" w:hAnsi="Symbol" w:hint="default"/>
+      </w:rPr>
+    </w:lvl>
+    <w:lvl w:ilvl="1" w:tplc="D8DABF84">
+      <w:start w:val="1"/>
+      <w:numFmt w:val="bullet"/>
+      <w:lvlText w:val="o"/>
+      <w:lvlJc w:val="left"/>
+      <w:pPr>
+        <w:ind w:left="2520" w:hanging="360"/>
+      </w:pPr>
+      <w:rPr>
+        <w:rFonts w:ascii="Courier New" w:hAnsi="Courier New" w:hint="default"/>
+      </w:rPr>
+    </w:lvl>
+    <w:lvl w:ilvl="2" w:tplc="A5B0FBBA">
+      <w:start w:val="1"/>
+      <w:numFmt w:val="bullet"/>
+      <w:lvlText w:val=""/>
+      <w:lvlJc w:val="left"/>
+      <w:pPr>
+        <w:ind w:left="3240" w:hanging="360"/>
+      </w:pPr>
+      <w:rPr>
+        <w:rFonts w:ascii="Wingdings" w:hAnsi="Wingdings" w:hint="default"/>
+      </w:rPr>
+    </w:lvl>
+    <w:lvl w:ilvl="3" w:tplc="C0DEAC20">
+      <w:start w:val="1"/>
+      <w:numFmt w:val="bullet"/>
+      <w:lvlText w:val=""/>
+      <w:lvlJc w:val="left"/>
+      <w:pPr>
+        <w:ind w:left="3960" w:hanging="360"/>
+      </w:pPr>
+      <w:rPr>
+        <w:rFonts w:ascii="Symbol" w:hAnsi="Symbol" w:hint="default"/>
+      </w:rPr>
+    </w:lvl>
+    <w:lvl w:ilvl="4" w:tplc="D71AB996">
+      <w:start w:val="1"/>
+      <w:numFmt w:val="bullet"/>
+      <w:lvlText w:val="o"/>
+      <w:lvlJc w:val="left"/>
+      <w:pPr>
+        <w:ind w:left="4680" w:hanging="360"/>
+      </w:pPr>
+      <w:rPr>
+        <w:rFonts w:ascii="Courier New" w:hAnsi="Courier New" w:hint="default"/>
+      </w:rPr>
+    </w:lvl>
+    <w:lvl w:ilvl="5" w:tplc="6472F6F8">
+      <w:start w:val="1"/>
+      <w:numFmt w:val="bullet"/>
+      <w:lvlText w:val=""/>
+      <w:lvlJc w:val="left"/>
+      <w:pPr>
+        <w:ind w:left="5400" w:hanging="360"/>
+      </w:pPr>
+      <w:rPr>
+        <w:rFonts w:ascii="Wingdings" w:hAnsi="Wingdings" w:hint="default"/>
+      </w:rPr>
+    </w:lvl>
+    <w:lvl w:ilvl="6" w:tplc="3D820700">
+      <w:start w:val="1"/>
+      <w:numFmt w:val="bullet"/>
+      <w:lvlText w:val=""/>
+      <w:lvlJc w:val="left"/>
+      <w:pPr>
+        <w:ind w:left="6120" w:hanging="360"/>
+      </w:pPr>
+      <w:rPr>
+        <w:rFonts w:ascii="Symbol" w:hAnsi="Symbol" w:hint="default"/>
+      </w:rPr>
+    </w:lvl>
+    <w:lvl w:ilvl="7" w:tplc="EA684FB6">
+      <w:start w:val="1"/>
+      <w:numFmt w:val="bullet"/>
+      <w:lvlText w:val="o"/>
+      <w:lvlJc w:val="left"/>
+      <w:pPr>
+        <w:ind w:left="6840" w:hanging="360"/>
+      </w:pPr>
+      <w:rPr>
+        <w:rFonts w:ascii="Courier New" w:hAnsi="Courier New" w:hint="default"/>
+      </w:rPr>
+    </w:lvl>
+    <w:lvl w:ilvl="8" w:tplc="8D94E1EE">
+      <w:start w:val="1"/>
+      <w:numFmt w:val="bullet"/>
+      <w:lvlText w:val=""/>
+      <w:lvlJc w:val="left"/>
+      <w:pPr>
+        <w:ind w:left="7560" w:hanging="360"/>
+      </w:pPr>
+      <w:rPr>
+        <w:rFonts w:ascii="Wingdings" w:hAnsi="Wingdings" w:hint="default"/>
+      </w:rPr>
+    </w:lvl>
+  </w:abstractNum>
+  <w:abstractNum w:abstractNumId="11" w15:restartNumberingAfterBreak="0">
     <w:nsid w:val="67F43E05"/>
     <w:multiLevelType w:val="singleLevel"/>
     <w:tmpl w:val="04090001"/>
@@ -967,11 +873,11 @@
         <w:ind w:left="360" w:hanging="360"/>
       </w:pPr>
       <w:rPr>
-        <w:rFonts w:hint="default" w:ascii="Symbol" w:hAnsi="Symbol"/>
+        <w:rFonts w:ascii="Symbol" w:hAnsi="Symbol" w:hint="default"/>
       </w:rPr>
     </w:lvl>
   </w:abstractNum>
-  <w:abstractNum w:abstractNumId="9" w15:restartNumberingAfterBreak="0">
+  <w:abstractNum w:abstractNumId="12" w15:restartNumberingAfterBreak="0">
     <w:nsid w:val="7C337829"/>
     <w:multiLevelType w:val="singleLevel"/>
     <w:tmpl w:val="04090001"/>
@@ -987,48 +893,48 @@
         <w:ind w:left="360" w:hanging="360"/>
       </w:pPr>
       <w:rPr>
-        <w:rFonts w:hint="default" w:ascii="Symbol" w:hAnsi="Symbol"/>
+        <w:rFonts w:ascii="Symbol" w:hAnsi="Symbol" w:hint="default"/>
       </w:rPr>
     </w:lvl>
   </w:abstractNum>
-  <w:num w:numId="13">
+  <w:num w:numId="1" w16cid:durableId="1102649551">
+    <w:abstractNumId w:val="6"/>
+  </w:num>
+  <w:num w:numId="2" w16cid:durableId="286543332">
+    <w:abstractNumId w:val="2"/>
+  </w:num>
+  <w:num w:numId="3" w16cid:durableId="2081978110">
+    <w:abstractNumId w:val="10"/>
+  </w:num>
+  <w:num w:numId="4" w16cid:durableId="370107763">
+    <w:abstractNumId w:val="1"/>
+  </w:num>
+  <w:num w:numId="5" w16cid:durableId="867376863">
+    <w:abstractNumId w:val="7"/>
+  </w:num>
+  <w:num w:numId="6" w16cid:durableId="2024744451">
+    <w:abstractNumId w:val="4"/>
+  </w:num>
+  <w:num w:numId="7" w16cid:durableId="1764717457">
+    <w:abstractNumId w:val="8"/>
+  </w:num>
+  <w:num w:numId="8" w16cid:durableId="1250894457">
+    <w:abstractNumId w:val="5"/>
+  </w:num>
+  <w:num w:numId="9" w16cid:durableId="1199589182">
+    <w:abstractNumId w:val="3"/>
+  </w:num>
+  <w:num w:numId="10" w16cid:durableId="1588029016">
+    <w:abstractNumId w:val="0"/>
+  </w:num>
+  <w:num w:numId="11" w16cid:durableId="323702806">
+    <w:abstractNumId w:val="11"/>
+  </w:num>
+  <w:num w:numId="12" w16cid:durableId="708382064">
     <w:abstractNumId w:val="12"/>
   </w:num>
-  <w:num w:numId="12">
-    <w:abstractNumId w:val="11"/>
-  </w:num>
-  <w:num w:numId="11">
-    <w:abstractNumId w:val="10"/>
-  </w:num>
-  <w:num w:numId="1" w16cid:durableId="370107763">
-    <w:abstractNumId w:val="1"/>
-  </w:num>
-  <w:num w:numId="2" w16cid:durableId="867376863">
-    <w:abstractNumId w:val="5"/>
-  </w:num>
-  <w:num w:numId="3" w16cid:durableId="2024744451">
-    <w:abstractNumId w:val="3"/>
-  </w:num>
-  <w:num w:numId="4" w16cid:durableId="1764717457">
-    <w:abstractNumId w:val="6"/>
-  </w:num>
-  <w:num w:numId="5" w16cid:durableId="1250894457">
-    <w:abstractNumId w:val="4"/>
-  </w:num>
-  <w:num w:numId="6" w16cid:durableId="1199589182">
-    <w:abstractNumId w:val="2"/>
-  </w:num>
-  <w:num w:numId="7" w16cid:durableId="1588029016">
-    <w:abstractNumId w:val="0"/>
-  </w:num>
-  <w:num w:numId="8" w16cid:durableId="323702806">
-    <w:abstractNumId w:val="8"/>
-  </w:num>
-  <w:num w:numId="9" w16cid:durableId="708382064">
+  <w:num w:numId="13" w16cid:durableId="837379153">
     <w:abstractNumId w:val="9"/>
-  </w:num>
-  <w:num w:numId="10" w16cid:durableId="837379153">
-    <w:abstractNumId w:val="7"/>
   </w:num>
 </w:numbering>
 </file>
@@ -1038,7 +944,7 @@
   <w:docDefaults>
     <w:rPrDefault>
       <w:rPr>
-        <w:rFonts w:ascii="Times New Roman" w:hAnsi="Times New Roman" w:eastAsia="Times New Roman" w:cs="Times New Roman"/>
+        <w:rFonts w:ascii="Times New Roman" w:eastAsia="Times New Roman" w:hAnsi="Times New Roman" w:cs="Times New Roman"/>
         <w:lang w:val="en-AU" w:eastAsia="ja-JP" w:bidi="hi-IN"/>
       </w:rPr>
     </w:rPrDefault>
@@ -1049,12 +955,12 @@
     <w:lsdException w:name="heading 1" w:uiPriority="9" w:qFormat="1"/>
     <w:lsdException w:name="heading 2" w:uiPriority="9" w:qFormat="1"/>
     <w:lsdException w:name="heading 3" w:uiPriority="9" w:qFormat="1"/>
-    <w:lsdException w:name="heading 4" w:uiPriority="9" w:semiHidden="1" w:unhideWhenUsed="1" w:qFormat="1"/>
-    <w:lsdException w:name="heading 5" w:uiPriority="9" w:semiHidden="1" w:unhideWhenUsed="1" w:qFormat="1"/>
-    <w:lsdException w:name="heading 6" w:uiPriority="9" w:semiHidden="1" w:unhideWhenUsed="1" w:qFormat="1"/>
-    <w:lsdException w:name="heading 7" w:uiPriority="9" w:semiHidden="1" w:unhideWhenUsed="1" w:qFormat="1"/>
-    <w:lsdException w:name="heading 8" w:uiPriority="9" w:semiHidden="1" w:unhideWhenUsed="1" w:qFormat="1"/>
-    <w:lsdException w:name="heading 9" w:uiPriority="9" w:semiHidden="1" w:unhideWhenUsed="1" w:qFormat="1"/>
+    <w:lsdException w:name="heading 4" w:semiHidden="1" w:uiPriority="9" w:unhideWhenUsed="1" w:qFormat="1"/>
+    <w:lsdException w:name="heading 5" w:semiHidden="1" w:uiPriority="9" w:unhideWhenUsed="1" w:qFormat="1"/>
+    <w:lsdException w:name="heading 6" w:semiHidden="1" w:uiPriority="9" w:unhideWhenUsed="1" w:qFormat="1"/>
+    <w:lsdException w:name="heading 7" w:semiHidden="1" w:uiPriority="9" w:unhideWhenUsed="1" w:qFormat="1"/>
+    <w:lsdException w:name="heading 8" w:semiHidden="1" w:uiPriority="9" w:unhideWhenUsed="1" w:qFormat="1"/>
+    <w:lsdException w:name="heading 9" w:semiHidden="1" w:uiPriority="9" w:unhideWhenUsed="1" w:qFormat="1"/>
     <w:lsdException w:name="index 1" w:semiHidden="1" w:unhideWhenUsed="1"/>
     <w:lsdException w:name="index 2" w:semiHidden="1" w:unhideWhenUsed="1"/>
     <w:lsdException w:name="index 3" w:semiHidden="1" w:unhideWhenUsed="1"/>
@@ -1064,22 +970,22 @@
     <w:lsdException w:name="index 7" w:semiHidden="1" w:unhideWhenUsed="1"/>
     <w:lsdException w:name="index 8" w:semiHidden="1" w:unhideWhenUsed="1"/>
     <w:lsdException w:name="index 9" w:semiHidden="1" w:unhideWhenUsed="1"/>
-    <w:lsdException w:name="toc 1" w:uiPriority="39" w:semiHidden="1" w:unhideWhenUsed="1"/>
-    <w:lsdException w:name="toc 2" w:uiPriority="39" w:semiHidden="1" w:unhideWhenUsed="1"/>
-    <w:lsdException w:name="toc 3" w:uiPriority="39" w:semiHidden="1" w:unhideWhenUsed="1"/>
-    <w:lsdException w:name="toc 4" w:uiPriority="39" w:semiHidden="1" w:unhideWhenUsed="1"/>
-    <w:lsdException w:name="toc 5" w:uiPriority="39" w:semiHidden="1" w:unhideWhenUsed="1"/>
-    <w:lsdException w:name="toc 6" w:uiPriority="39" w:semiHidden="1" w:unhideWhenUsed="1"/>
-    <w:lsdException w:name="toc 7" w:uiPriority="39" w:semiHidden="1" w:unhideWhenUsed="1"/>
-    <w:lsdException w:name="toc 8" w:uiPriority="39" w:semiHidden="1" w:unhideWhenUsed="1"/>
-    <w:lsdException w:name="toc 9" w:uiPriority="39" w:semiHidden="1" w:unhideWhenUsed="1"/>
+    <w:lsdException w:name="toc 1" w:semiHidden="1" w:uiPriority="39" w:unhideWhenUsed="1"/>
+    <w:lsdException w:name="toc 2" w:semiHidden="1" w:uiPriority="39" w:unhideWhenUsed="1"/>
+    <w:lsdException w:name="toc 3" w:semiHidden="1" w:uiPriority="39" w:unhideWhenUsed="1"/>
+    <w:lsdException w:name="toc 4" w:semiHidden="1" w:uiPriority="39" w:unhideWhenUsed="1"/>
+    <w:lsdException w:name="toc 5" w:semiHidden="1" w:uiPriority="39" w:unhideWhenUsed="1"/>
+    <w:lsdException w:name="toc 6" w:semiHidden="1" w:uiPriority="39" w:unhideWhenUsed="1"/>
+    <w:lsdException w:name="toc 7" w:semiHidden="1" w:uiPriority="39" w:unhideWhenUsed="1"/>
+    <w:lsdException w:name="toc 8" w:semiHidden="1" w:uiPriority="39" w:unhideWhenUsed="1"/>
+    <w:lsdException w:name="toc 9" w:semiHidden="1" w:uiPriority="39" w:unhideWhenUsed="1"/>
     <w:lsdException w:name="Normal Indent" w:semiHidden="1" w:unhideWhenUsed="1"/>
     <w:lsdException w:name="footnote text" w:semiHidden="1" w:unhideWhenUsed="1"/>
     <w:lsdException w:name="annotation text" w:semiHidden="1" w:unhideWhenUsed="1"/>
     <w:lsdException w:name="header" w:semiHidden="1" w:unhideWhenUsed="1"/>
     <w:lsdException w:name="footer" w:semiHidden="1" w:unhideWhenUsed="1"/>
     <w:lsdException w:name="index heading" w:semiHidden="1" w:unhideWhenUsed="1"/>
-    <w:lsdException w:name="caption" w:uiPriority="35" w:semiHidden="1" w:unhideWhenUsed="1" w:qFormat="1"/>
+    <w:lsdException w:name="caption" w:semiHidden="1" w:uiPriority="35" w:unhideWhenUsed="1" w:qFormat="1"/>
     <w:lsdException w:name="table of figures" w:semiHidden="1" w:unhideWhenUsed="1"/>
     <w:lsdException w:name="envelope address" w:semiHidden="1" w:unhideWhenUsed="1"/>
     <w:lsdException w:name="envelope return" w:semiHidden="1" w:unhideWhenUsed="1"/>
@@ -1110,7 +1016,7 @@
     <w:lsdException w:name="Title" w:uiPriority="10" w:qFormat="1"/>
     <w:lsdException w:name="Closing" w:semiHidden="1" w:unhideWhenUsed="1"/>
     <w:lsdException w:name="Signature" w:semiHidden="1" w:unhideWhenUsed="1"/>
-    <w:lsdException w:name="Default Paragraph Font" w:uiPriority="1" w:semiHidden="1" w:unhideWhenUsed="1"/>
+    <w:lsdException w:name="Default Paragraph Font" w:semiHidden="1" w:uiPriority="1" w:unhideWhenUsed="1"/>
     <w:lsdException w:name="Body Text" w:semiHidden="1" w:unhideWhenUsed="1"/>
     <w:lsdException w:name="Body Text Indent" w:semiHidden="1" w:unhideWhenUsed="1"/>
     <w:lsdException w:name="List Continue" w:semiHidden="1" w:unhideWhenUsed="1"/>
@@ -1311,7 +1217,7 @@
     <w:lsdException w:name="Intense Reference" w:uiPriority="68" w:qFormat="1"/>
     <w:lsdException w:name="Book Title" w:uiPriority="69" w:qFormat="1"/>
     <w:lsdException w:name="Bibliography" w:uiPriority="70"/>
-    <w:lsdException w:name="TOC Heading" w:uiPriority="71" w:semiHidden="1" w:unhideWhenUsed="1" w:qFormat="1"/>
+    <w:lsdException w:name="TOC Heading" w:semiHidden="1" w:uiPriority="71" w:unhideWhenUsed="1" w:qFormat="1"/>
     <w:lsdException w:name="Plain Table 1" w:uiPriority="72"/>
     <w:lsdException w:name="Plain Table 2" w:uiPriority="73"/>
     <w:lsdException w:name="Plain Table 3" w:uiPriority="19" w:qFormat="1"/>
@@ -1422,7 +1328,7 @@
     <w:lsdException w:name="Unresolved Mention" w:semiHidden="1" w:unhideWhenUsed="1"/>
     <w:lsdException w:name="Smart Link" w:semiHidden="1" w:unhideWhenUsed="1"/>
   </w:latentStyles>
-  <w:style w:type="paragraph" w:styleId="Normal" w:default="1">
+  <w:style w:type="paragraph" w:default="1" w:styleId="Normal">
     <w:name w:val="Normal"/>
     <w:qFormat/>
     <w:rsid w:val="00110D81"/>
@@ -1477,13 +1383,13 @@
       <w:szCs w:val="26"/>
     </w:rPr>
   </w:style>
-  <w:style w:type="character" w:styleId="DefaultParagraphFont" w:default="1">
+  <w:style w:type="character" w:default="1" w:styleId="DefaultParagraphFont">
     <w:name w:val="Default Paragraph Font"/>
     <w:uiPriority w:val="1"/>
     <w:semiHidden/>
     <w:unhideWhenUsed/>
   </w:style>
-  <w:style w:type="table" w:styleId="TableNormal" w:default="1">
+  <w:style w:type="table" w:default="1" w:styleId="TableNormal">
     <w:name w:val="Normal Table"/>
     <w:uiPriority w:val="99"/>
     <w:semiHidden/>
@@ -1498,7 +1404,7 @@
       </w:tblCellMar>
     </w:tblPr>
   </w:style>
-  <w:style w:type="numbering" w:styleId="NoList" w:default="1">
+  <w:style w:type="numbering" w:default="1" w:styleId="NoList">
     <w:name w:val="No List"/>
     <w:uiPriority w:val="99"/>
     <w:semiHidden/>
@@ -1513,7 +1419,7 @@
       <w:jc w:val="both"/>
     </w:pPr>
   </w:style>
-  <w:style w:type="paragraph" w:styleId="Abstract" w:customStyle="1">
+  <w:style w:type="paragraph" w:customStyle="1" w:styleId="Abstract">
     <w:name w:val="Abstract"/>
     <w:basedOn w:val="Normal"/>
     <w:rsid w:val="00783611"/>
@@ -1541,7 +1447,7 @@
       <w:lang w:val="en-US" w:eastAsia="en-US" w:bidi="ar-SA"/>
     </w:rPr>
   </w:style>
-  <w:style w:type="paragraph" w:styleId="References" w:customStyle="1">
+  <w:style w:type="paragraph" w:customStyle="1" w:styleId="References">
     <w:name w:val="References"/>
     <w:basedOn w:val="Normal"/>
     <w:rsid w:val="00110D81"/>
@@ -1550,108 +1456,136 @@
       <w:jc w:val="both"/>
     </w:pPr>
   </w:style>
-  <w:style w:type="paragraph" w:styleId="Bibliography" w:customStyle="true">
-    <w:uiPriority w:val="1"/>
-    <w:name w:val="Bibliography"/>
+  <w:style w:type="paragraph" w:customStyle="1" w:styleId="Bibliography1">
+    <w:name w:val="Bibliography1"/>
     <w:basedOn w:val="Normal"/>
     <w:link w:val="BibliographyChar"/>
+    <w:uiPriority w:val="1"/>
     <w:qFormat/>
     <w:rsid w:val="755330E5"/>
-    <w:rPr>
-      <w:rFonts w:ascii="Times New Roman" w:hAnsi="Times New Roman" w:eastAsia="Times New Roman" w:cs="Times New Roman"/>
-    </w:rPr>
     <w:pPr>
       <w:ind w:left="360" w:hanging="360"/>
       <w:jc w:val="both"/>
     </w:pPr>
   </w:style>
-  <w:style w:type="character" w:styleId="BibliographyChar" w:customStyle="true">
+  <w:style w:type="character" w:customStyle="1" w:styleId="BibliographyChar">
     <w:name w:val="Bibliography Char"/>
     <w:basedOn w:val="DefaultParagraphFont"/>
-    <w:link w:val="Bibliography"/>
+    <w:link w:val="Bibliography1"/>
     <w:rsid w:val="755330E5"/>
     <w:rPr>
-      <w:rFonts w:ascii="Times New Roman" w:hAnsi="Times New Roman" w:eastAsia="Times New Roman" w:cs="Times New Roman"/>
+      <w:rFonts w:ascii="Times New Roman" w:eastAsia="Times New Roman" w:hAnsi="Times New Roman" w:cs="Times New Roman"/>
       <w:sz w:val="22"/>
       <w:szCs w:val="22"/>
       <w:lang w:val="en-US" w:eastAsia="en-US" w:bidi="ar-SA"/>
     </w:rPr>
   </w:style>
-  <w:style w:type="paragraph" w:styleId="ImageCaption" w:customStyle="true">
-    <w:uiPriority w:val="1"/>
+  <w:style w:type="paragraph" w:customStyle="1" w:styleId="ImageCaption">
     <w:name w:val="ImageCaption"/>
     <w:basedOn w:val="Normal"/>
     <w:link w:val="ImageCaptionChar"/>
+    <w:uiPriority w:val="1"/>
     <w:qFormat/>
     <w:rsid w:val="755330E5"/>
-    <w:rPr>
-      <w:rFonts w:ascii="Times New Roman" w:hAnsi="Times New Roman" w:eastAsia="Times New Roman" w:cs="Times New Roman"/>
-    </w:rPr>
     <w:pPr>
       <w:jc w:val="center"/>
     </w:pPr>
   </w:style>
-  <w:style w:type="character" w:styleId="ImageCaptionChar" w:customStyle="true">
+  <w:style w:type="character" w:customStyle="1" w:styleId="ImageCaptionChar">
     <w:name w:val="ImageCaption Char"/>
     <w:basedOn w:val="DefaultParagraphFont"/>
     <w:link w:val="ImageCaption"/>
     <w:rsid w:val="755330E5"/>
     <w:rPr>
-      <w:rFonts w:ascii="Times New Roman" w:hAnsi="Times New Roman" w:eastAsia="Times New Roman" w:cs="Times New Roman"/>
+      <w:rFonts w:ascii="Times New Roman" w:eastAsia="Times New Roman" w:hAnsi="Times New Roman" w:cs="Times New Roman"/>
       <w:sz w:val="22"/>
       <w:szCs w:val="22"/>
       <w:lang w:val="en-US" w:eastAsia="en-US" w:bidi="ar-SA"/>
     </w:rPr>
   </w:style>
   <w:style w:type="paragraph" w:styleId="ListParagraph">
-    <w:uiPriority w:val="34"/>
     <w:name w:val="List Paragraph"/>
     <w:basedOn w:val="Normal"/>
+    <w:uiPriority w:val="34"/>
     <w:qFormat/>
     <w:rsid w:val="755330E5"/>
     <w:pPr>
-      <w:spacing/>
       <w:ind w:left="720"/>
       <w:contextualSpacing/>
     </w:pPr>
   </w:style>
-  <w:style w:type="paragraph" w:styleId="BulletList" w:customStyle="true">
-    <w:uiPriority w:val="1"/>
+  <w:style w:type="paragraph" w:customStyle="1" w:styleId="BulletList">
     <w:name w:val="BulletList"/>
     <w:basedOn w:val="Normal"/>
     <w:link w:val="BulletListChar"/>
+    <w:uiPriority w:val="1"/>
     <w:qFormat/>
     <w:rsid w:val="755330E5"/>
-    <w:rPr>
-      <w:rFonts w:ascii="Times New Roman" w:hAnsi="Times New Roman" w:eastAsia="Times New Roman" w:cs="Times New Roman"/>
-      <w:color w:val="000000" w:themeColor="text1" w:themeTint="FF" w:themeShade="FF"/>
-    </w:rPr>
     <w:pPr>
       <w:numPr>
-        <w:ilvl w:val="0"/>
-        <w:numId w:val="3"/>
+        <w:numId w:val="6"/>
       </w:numPr>
       <w:jc w:val="both"/>
     </w:pPr>
-  </w:style>
-  <w:style w:type="character" w:styleId="BulletListChar" w:customStyle="true">
+    <w:rPr>
+      <w:color w:val="000000" w:themeColor="text1"/>
+    </w:rPr>
+  </w:style>
+  <w:style w:type="character" w:customStyle="1" w:styleId="BulletListChar">
     <w:name w:val="BulletList Char"/>
     <w:basedOn w:val="DefaultParagraphFont"/>
     <w:link w:val="BulletList"/>
     <w:rsid w:val="755330E5"/>
     <w:rPr>
-      <w:rFonts w:ascii="Times New Roman" w:hAnsi="Times New Roman" w:eastAsia="Times New Roman" w:cs="Times New Roman"/>
-      <w:color w:val="000000" w:themeColor="text1" w:themeTint="FF" w:themeShade="FF"/>
+      <w:rFonts w:ascii="Times New Roman" w:eastAsia="Times New Roman" w:hAnsi="Times New Roman" w:cs="Times New Roman"/>
+      <w:color w:val="000000" w:themeColor="text1"/>
       <w:sz w:val="22"/>
       <w:szCs w:val="22"/>
       <w:lang w:val="en-US" w:eastAsia="en-US" w:bidi="ar-SA"/>
     </w:rPr>
   </w:style>
+  <w:style w:type="paragraph" w:customStyle="1" w:styleId="SourceCode">
+    <w:name w:val="Source Code"/>
+    <w:basedOn w:val="BlockText"/>
+    <w:qFormat/>
+    <w:rsid w:val="00DC7C9F"/>
+    <w:pPr>
+      <w:shd w:val="clear" w:color="auto" w:fill="F1F3F5"/>
+      <w:ind w:left="284" w:right="284"/>
+    </w:pPr>
+    <w:rPr>
+      <w:rFonts w:ascii="Courier New" w:hAnsi="Courier New"/>
+      <w:i w:val="0"/>
+    </w:rPr>
+  </w:style>
+  <w:style w:type="paragraph" w:styleId="BlockText">
+    <w:name w:val="Block Text"/>
+    <w:basedOn w:val="Normal"/>
+    <w:uiPriority w:val="99"/>
+    <w:semiHidden/>
+    <w:unhideWhenUsed/>
+    <w:rsid w:val="00DC7C9F"/>
+    <w:pPr>
+      <w:pBdr>
+        <w:top w:val="single" w:sz="2" w:space="10" w:color="156082" w:themeColor="accent1"/>
+        <w:left w:val="single" w:sz="2" w:space="10" w:color="156082" w:themeColor="accent1"/>
+        <w:bottom w:val="single" w:sz="2" w:space="10" w:color="156082" w:themeColor="accent1"/>
+        <w:right w:val="single" w:sz="2" w:space="10" w:color="156082" w:themeColor="accent1"/>
+      </w:pBdr>
+      <w:ind w:left="1152" w:right="1152"/>
+    </w:pPr>
+    <w:rPr>
+      <w:rFonts w:asciiTheme="minorHAnsi" w:eastAsiaTheme="minorEastAsia" w:hAnsiTheme="minorHAnsi" w:cstheme="minorBidi"/>
+      <w:i/>
+      <w:iCs/>
+      <w:color w:val="156082" w:themeColor="accent1"/>
+    </w:rPr>
+  </w:style>
 </w:styles>
 </file>
 
 <file path=word/theme/theme1.xml><?xml version="1.0" encoding="utf-8"?>
-<a:theme xmlns:a="http://schemas.openxmlformats.org/drawingml/2006/main" xmlns:thm15="http://schemas.microsoft.com/office/thememl/2012/main" name="Office Theme">
+<a:theme xmlns:a="http://schemas.openxmlformats.org/drawingml/2006/main" name="Office Theme">
   <a:themeElements>
     <a:clrScheme name="Office">
       <a:dk1>

</xml_diff>